<commit_message>
Creacion de solicitudes de Cambio
</commit_message>
<xml_diff>
--- a/Documentacion/Planes/SONNY-PGC.docx
+++ b/Documentacion/Planes/SONNY-PGC.docx
@@ -452,7 +452,7 @@
     </w:p>
     <w:sdt>
       <w:sdtPr>
-        <w:id w:val="526164906"/>
+        <w:id w:val="496851662"/>
         <w:docPartObj>
           <w:docPartGallery w:val="Table of Contents"/>
           <w:docPartUnique w:val="1"/>
@@ -3078,7 +3078,7 @@
     <w:sdt>
       <w:sdtPr>
         <w:lock w:val="contentLocked"/>
-        <w:id w:val="-1443029699"/>
+        <w:id w:val="1997096594"/>
         <w:tag w:val="goog_rdk_0"/>
       </w:sdtPr>
       <w:sdtContent>
@@ -3842,7 +3842,7 @@
     <w:sdt>
       <w:sdtPr>
         <w:lock w:val="contentLocked"/>
-        <w:id w:val="-1487141175"/>
+        <w:id w:val="-1867795388"/>
         <w:tag w:val="goog_rdk_1"/>
       </w:sdtPr>
       <w:sdtContent>
@@ -4879,7 +4879,7 @@
     <w:sdt>
       <w:sdtPr>
         <w:lock w:val="contentLocked"/>
-        <w:id w:val="7621414"/>
+        <w:id w:val="586088857"/>
         <w:tag w:val="goog_rdk_2"/>
       </w:sdtPr>
       <w:sdtContent>
@@ -7500,7 +7500,7 @@
     <w:sdt>
       <w:sdtPr>
         <w:lock w:val="contentLocked"/>
-        <w:id w:val="-989437882"/>
+        <w:id w:val="-1661328867"/>
         <w:tag w:val="goog_rdk_3"/>
       </w:sdtPr>
       <w:sdtContent>
@@ -10747,7 +10747,7 @@
     <w:sdt>
       <w:sdtPr>
         <w:lock w:val="contentLocked"/>
-        <w:id w:val="1660004908"/>
+        <w:id w:val="250202351"/>
         <w:tag w:val="goog_rdk_4"/>
       </w:sdtPr>
       <w:sdtContent>
@@ -10885,7 +10885,7 @@
     <w:sdt>
       <w:sdtPr>
         <w:lock w:val="contentLocked"/>
-        <w:id w:val="4550783"/>
+        <w:id w:val="1471000023"/>
         <w:tag w:val="goog_rdk_5"/>
       </w:sdtPr>
       <w:sdtContent>
@@ -11038,7 +11038,7 @@
     <w:sdt>
       <w:sdtPr>
         <w:lock w:val="contentLocked"/>
-        <w:id w:val="-707085735"/>
+        <w:id w:val="-987064893"/>
         <w:tag w:val="goog_rdk_6"/>
       </w:sdtPr>
       <w:sdtContent>
@@ -11176,7 +11176,7 @@
     <w:sdt>
       <w:sdtPr>
         <w:lock w:val="contentLocked"/>
-        <w:id w:val="-245860633"/>
+        <w:id w:val="-1207348140"/>
         <w:tag w:val="goog_rdk_7"/>
       </w:sdtPr>
       <w:sdtContent>
@@ -11652,6 +11652,7 @@
               <w:bottom w:color="e0e0e0" w:space="0" w:sz="8" w:val="single"/>
               <w:right w:color="ffffff" w:space="0" w:sz="8" w:val="single"/>
             </w:tcBorders>
+            <w:shd w:fill="efefef" w:val="clear"/>
             <w:tcMar>
               <w:top w:w="100.0" w:type="dxa"/>
               <w:left w:w="100.0" w:type="dxa"/>
@@ -11684,6 +11685,7 @@
               <w:bottom w:color="e0e0e0" w:space="0" w:sz="8" w:val="single"/>
               <w:right w:color="ffffff" w:space="0" w:sz="8" w:val="single"/>
             </w:tcBorders>
+            <w:shd w:fill="efefef" w:val="clear"/>
             <w:tcMar>
               <w:top w:w="100.0" w:type="dxa"/>
               <w:left w:w="100.0" w:type="dxa"/>
@@ -11716,6 +11718,7 @@
               <w:bottom w:color="e0e0e0" w:space="0" w:sz="8" w:val="single"/>
               <w:right w:color="ffffff" w:space="0" w:sz="8" w:val="single"/>
             </w:tcBorders>
+            <w:shd w:fill="efefef" w:val="clear"/>
             <w:tcMar>
               <w:top w:w="100.0" w:type="dxa"/>
               <w:left w:w="100.0" w:type="dxa"/>
@@ -11748,6 +11751,7 @@
               <w:bottom w:color="e0e0e0" w:space="0" w:sz="8" w:val="single"/>
               <w:right w:color="ffffff" w:space="0" w:sz="8" w:val="single"/>
             </w:tcBorders>
+            <w:shd w:fill="efefef" w:val="clear"/>
             <w:tcMar>
               <w:top w:w="100.0" w:type="dxa"/>
               <w:left w:w="100.0" w:type="dxa"/>
@@ -11922,6 +11926,7 @@
               <w:bottom w:color="e0e0e0" w:space="0" w:sz="8" w:val="single"/>
               <w:right w:color="ffffff" w:space="0" w:sz="8" w:val="single"/>
             </w:tcBorders>
+            <w:shd w:fill="efefef" w:val="clear"/>
             <w:tcMar>
               <w:top w:w="100.0" w:type="dxa"/>
               <w:left w:w="100.0" w:type="dxa"/>
@@ -11954,6 +11959,7 @@
               <w:bottom w:color="e0e0e0" w:space="0" w:sz="8" w:val="single"/>
               <w:right w:color="ffffff" w:space="0" w:sz="8" w:val="single"/>
             </w:tcBorders>
+            <w:shd w:fill="efefef" w:val="clear"/>
             <w:tcMar>
               <w:top w:w="100.0" w:type="dxa"/>
               <w:left w:w="100.0" w:type="dxa"/>
@@ -11986,6 +11992,7 @@
               <w:bottom w:color="e0e0e0" w:space="0" w:sz="8" w:val="single"/>
               <w:right w:color="ffffff" w:space="0" w:sz="8" w:val="single"/>
             </w:tcBorders>
+            <w:shd w:fill="efefef" w:val="clear"/>
             <w:tcMar>
               <w:top w:w="100.0" w:type="dxa"/>
               <w:left w:w="100.0" w:type="dxa"/>
@@ -12018,6 +12025,7 @@
               <w:bottom w:color="e0e0e0" w:space="0" w:sz="8" w:val="single"/>
               <w:right w:color="ffffff" w:space="0" w:sz="8" w:val="single"/>
             </w:tcBorders>
+            <w:shd w:fill="efefef" w:val="clear"/>
             <w:tcMar>
               <w:top w:w="100.0" w:type="dxa"/>
               <w:left w:w="100.0" w:type="dxa"/>
@@ -12192,6 +12200,7 @@
               <w:bottom w:color="e0e0e0" w:space="0" w:sz="8" w:val="single"/>
               <w:right w:color="ffffff" w:space="0" w:sz="8" w:val="single"/>
             </w:tcBorders>
+            <w:shd w:fill="efefef" w:val="clear"/>
             <w:tcMar>
               <w:top w:w="100.0" w:type="dxa"/>
               <w:left w:w="100.0" w:type="dxa"/>
@@ -12224,6 +12233,7 @@
               <w:bottom w:color="e0e0e0" w:space="0" w:sz="8" w:val="single"/>
               <w:right w:color="ffffff" w:space="0" w:sz="8" w:val="single"/>
             </w:tcBorders>
+            <w:shd w:fill="efefef" w:val="clear"/>
             <w:tcMar>
               <w:top w:w="100.0" w:type="dxa"/>
               <w:left w:w="100.0" w:type="dxa"/>
@@ -12256,6 +12266,7 @@
               <w:bottom w:color="e0e0e0" w:space="0" w:sz="8" w:val="single"/>
               <w:right w:color="ffffff" w:space="0" w:sz="8" w:val="single"/>
             </w:tcBorders>
+            <w:shd w:fill="efefef" w:val="clear"/>
             <w:tcMar>
               <w:top w:w="100.0" w:type="dxa"/>
               <w:left w:w="100.0" w:type="dxa"/>
@@ -12288,6 +12299,7 @@
               <w:bottom w:color="e0e0e0" w:space="0" w:sz="8" w:val="single"/>
               <w:right w:color="ffffff" w:space="0" w:sz="8" w:val="single"/>
             </w:tcBorders>
+            <w:shd w:fill="efefef" w:val="clear"/>
             <w:tcMar>
               <w:top w:w="100.0" w:type="dxa"/>
               <w:left w:w="100.0" w:type="dxa"/>
@@ -12462,6 +12474,7 @@
               <w:bottom w:color="e0e0e0" w:space="0" w:sz="8" w:val="single"/>
               <w:right w:color="ffffff" w:space="0" w:sz="8" w:val="single"/>
             </w:tcBorders>
+            <w:shd w:fill="efefef" w:val="clear"/>
             <w:tcMar>
               <w:top w:w="100.0" w:type="dxa"/>
               <w:left w:w="100.0" w:type="dxa"/>
@@ -12494,6 +12507,7 @@
               <w:bottom w:color="e0e0e0" w:space="0" w:sz="8" w:val="single"/>
               <w:right w:color="ffffff" w:space="0" w:sz="8" w:val="single"/>
             </w:tcBorders>
+            <w:shd w:fill="efefef" w:val="clear"/>
             <w:tcMar>
               <w:top w:w="100.0" w:type="dxa"/>
               <w:left w:w="100.0" w:type="dxa"/>
@@ -12526,6 +12540,7 @@
               <w:bottom w:color="e0e0e0" w:space="0" w:sz="8" w:val="single"/>
               <w:right w:color="ffffff" w:space="0" w:sz="8" w:val="single"/>
             </w:tcBorders>
+            <w:shd w:fill="efefef" w:val="clear"/>
             <w:tcMar>
               <w:top w:w="100.0" w:type="dxa"/>
               <w:left w:w="100.0" w:type="dxa"/>
@@ -12558,6 +12573,7 @@
               <w:bottom w:color="e0e0e0" w:space="0" w:sz="8" w:val="single"/>
               <w:right w:color="ffffff" w:space="0" w:sz="8" w:val="single"/>
             </w:tcBorders>
+            <w:shd w:fill="efefef" w:val="clear"/>
             <w:tcMar>
               <w:top w:w="100.0" w:type="dxa"/>
               <w:left w:w="100.0" w:type="dxa"/>
@@ -12732,6 +12748,7 @@
               <w:bottom w:color="e0e0e0" w:space="0" w:sz="8" w:val="single"/>
               <w:right w:color="ffffff" w:space="0" w:sz="8" w:val="single"/>
             </w:tcBorders>
+            <w:shd w:fill="efefef" w:val="clear"/>
             <w:tcMar>
               <w:top w:w="100.0" w:type="dxa"/>
               <w:left w:w="100.0" w:type="dxa"/>
@@ -12764,6 +12781,7 @@
               <w:bottom w:color="e0e0e0" w:space="0" w:sz="8" w:val="single"/>
               <w:right w:color="ffffff" w:space="0" w:sz="8" w:val="single"/>
             </w:tcBorders>
+            <w:shd w:fill="efefef" w:val="clear"/>
             <w:tcMar>
               <w:top w:w="100.0" w:type="dxa"/>
               <w:left w:w="100.0" w:type="dxa"/>
@@ -12796,6 +12814,7 @@
               <w:bottom w:color="e0e0e0" w:space="0" w:sz="8" w:val="single"/>
               <w:right w:color="ffffff" w:space="0" w:sz="8" w:val="single"/>
             </w:tcBorders>
+            <w:shd w:fill="efefef" w:val="clear"/>
             <w:tcMar>
               <w:top w:w="100.0" w:type="dxa"/>
               <w:left w:w="100.0" w:type="dxa"/>
@@ -12828,6 +12847,7 @@
               <w:bottom w:color="e0e0e0" w:space="0" w:sz="8" w:val="single"/>
               <w:right w:color="ffffff" w:space="0" w:sz="8" w:val="single"/>
             </w:tcBorders>
+            <w:shd w:fill="efefef" w:val="clear"/>
             <w:tcMar>
               <w:top w:w="100.0" w:type="dxa"/>
               <w:left w:w="100.0" w:type="dxa"/>
@@ -13002,6 +13022,7 @@
               <w:bottom w:color="e0e0e0" w:space="0" w:sz="8" w:val="single"/>
               <w:right w:color="ffffff" w:space="0" w:sz="8" w:val="single"/>
             </w:tcBorders>
+            <w:shd w:fill="efefef" w:val="clear"/>
             <w:tcMar>
               <w:top w:w="100.0" w:type="dxa"/>
               <w:left w:w="100.0" w:type="dxa"/>
@@ -13034,6 +13055,7 @@
               <w:bottom w:color="e0e0e0" w:space="0" w:sz="8" w:val="single"/>
               <w:right w:color="ffffff" w:space="0" w:sz="8" w:val="single"/>
             </w:tcBorders>
+            <w:shd w:fill="efefef" w:val="clear"/>
             <w:tcMar>
               <w:top w:w="100.0" w:type="dxa"/>
               <w:left w:w="100.0" w:type="dxa"/>
@@ -13066,6 +13088,7 @@
               <w:bottom w:color="e0e0e0" w:space="0" w:sz="8" w:val="single"/>
               <w:right w:color="ffffff" w:space="0" w:sz="8" w:val="single"/>
             </w:tcBorders>
+            <w:shd w:fill="efefef" w:val="clear"/>
             <w:tcMar>
               <w:top w:w="100.0" w:type="dxa"/>
               <w:left w:w="100.0" w:type="dxa"/>
@@ -13098,6 +13121,7 @@
               <w:bottom w:color="e0e0e0" w:space="0" w:sz="8" w:val="single"/>
               <w:right w:color="ffffff" w:space="0" w:sz="8" w:val="single"/>
             </w:tcBorders>
+            <w:shd w:fill="efefef" w:val="clear"/>
             <w:tcMar>
               <w:top w:w="100.0" w:type="dxa"/>
               <w:left w:w="100.0" w:type="dxa"/>
@@ -13272,6 +13296,7 @@
               <w:bottom w:color="e0e0e0" w:space="0" w:sz="8" w:val="single"/>
               <w:right w:color="ffffff" w:space="0" w:sz="8" w:val="single"/>
             </w:tcBorders>
+            <w:shd w:fill="efefef" w:val="clear"/>
             <w:tcMar>
               <w:top w:w="100.0" w:type="dxa"/>
               <w:left w:w="100.0" w:type="dxa"/>
@@ -13304,6 +13329,7 @@
               <w:bottom w:color="e0e0e0" w:space="0" w:sz="8" w:val="single"/>
               <w:right w:color="ffffff" w:space="0" w:sz="8" w:val="single"/>
             </w:tcBorders>
+            <w:shd w:fill="efefef" w:val="clear"/>
             <w:tcMar>
               <w:top w:w="100.0" w:type="dxa"/>
               <w:left w:w="100.0" w:type="dxa"/>
@@ -13336,6 +13362,7 @@
               <w:bottom w:color="e0e0e0" w:space="0" w:sz="8" w:val="single"/>
               <w:right w:color="ffffff" w:space="0" w:sz="8" w:val="single"/>
             </w:tcBorders>
+            <w:shd w:fill="efefef" w:val="clear"/>
             <w:tcMar>
               <w:top w:w="100.0" w:type="dxa"/>
               <w:left w:w="100.0" w:type="dxa"/>
@@ -13368,6 +13395,7 @@
               <w:bottom w:color="e0e0e0" w:space="0" w:sz="8" w:val="single"/>
               <w:right w:color="ffffff" w:space="0" w:sz="8" w:val="single"/>
             </w:tcBorders>
+            <w:shd w:fill="efefef" w:val="clear"/>
             <w:tcMar>
               <w:top w:w="100.0" w:type="dxa"/>
               <w:left w:w="100.0" w:type="dxa"/>
@@ -13542,6 +13570,7 @@
               <w:bottom w:color="e0e0e0" w:space="0" w:sz="8" w:val="single"/>
               <w:right w:color="ffffff" w:space="0" w:sz="8" w:val="single"/>
             </w:tcBorders>
+            <w:shd w:fill="efefef" w:val="clear"/>
             <w:tcMar>
               <w:top w:w="100.0" w:type="dxa"/>
               <w:left w:w="100.0" w:type="dxa"/>
@@ -13574,6 +13603,7 @@
               <w:bottom w:color="e0e0e0" w:space="0" w:sz="8" w:val="single"/>
               <w:right w:color="ffffff" w:space="0" w:sz="8" w:val="single"/>
             </w:tcBorders>
+            <w:shd w:fill="efefef" w:val="clear"/>
             <w:tcMar>
               <w:top w:w="100.0" w:type="dxa"/>
               <w:left w:w="100.0" w:type="dxa"/>
@@ -13606,6 +13636,7 @@
               <w:bottom w:color="e0e0e0" w:space="0" w:sz="8" w:val="single"/>
               <w:right w:color="ffffff" w:space="0" w:sz="8" w:val="single"/>
             </w:tcBorders>
+            <w:shd w:fill="efefef" w:val="clear"/>
             <w:tcMar>
               <w:top w:w="100.0" w:type="dxa"/>
               <w:left w:w="100.0" w:type="dxa"/>
@@ -13638,6 +13669,7 @@
               <w:bottom w:color="e0e0e0" w:space="0" w:sz="8" w:val="single"/>
               <w:right w:color="ffffff" w:space="0" w:sz="8" w:val="single"/>
             </w:tcBorders>
+            <w:shd w:fill="efefef" w:val="clear"/>
             <w:tcMar>
               <w:top w:w="100.0" w:type="dxa"/>
               <w:left w:w="100.0" w:type="dxa"/>
@@ -13812,6 +13844,7 @@
               <w:bottom w:color="e0e0e0" w:space="0" w:sz="8" w:val="single"/>
               <w:right w:color="ffffff" w:space="0" w:sz="8" w:val="single"/>
             </w:tcBorders>
+            <w:shd w:fill="efefef" w:val="clear"/>
             <w:tcMar>
               <w:top w:w="100.0" w:type="dxa"/>
               <w:left w:w="100.0" w:type="dxa"/>
@@ -13844,6 +13877,7 @@
               <w:bottom w:color="e0e0e0" w:space="0" w:sz="8" w:val="single"/>
               <w:right w:color="ffffff" w:space="0" w:sz="8" w:val="single"/>
             </w:tcBorders>
+            <w:shd w:fill="efefef" w:val="clear"/>
             <w:tcMar>
               <w:top w:w="100.0" w:type="dxa"/>
               <w:left w:w="100.0" w:type="dxa"/>
@@ -13876,6 +13910,7 @@
               <w:bottom w:color="e0e0e0" w:space="0" w:sz="8" w:val="single"/>
               <w:right w:color="ffffff" w:space="0" w:sz="8" w:val="single"/>
             </w:tcBorders>
+            <w:shd w:fill="efefef" w:val="clear"/>
             <w:tcMar>
               <w:top w:w="100.0" w:type="dxa"/>
               <w:left w:w="100.0" w:type="dxa"/>
@@ -13908,6 +13943,7 @@
               <w:bottom w:color="e0e0e0" w:space="0" w:sz="8" w:val="single"/>
               <w:right w:color="ffffff" w:space="0" w:sz="8" w:val="single"/>
             </w:tcBorders>
+            <w:shd w:fill="efefef" w:val="clear"/>
             <w:tcMar>
               <w:top w:w="100.0" w:type="dxa"/>
               <w:left w:w="100.0" w:type="dxa"/>
@@ -14082,6 +14118,7 @@
               <w:bottom w:color="e0e0e0" w:space="0" w:sz="8" w:val="single"/>
               <w:right w:color="ffffff" w:space="0" w:sz="8" w:val="single"/>
             </w:tcBorders>
+            <w:shd w:fill="efefef" w:val="clear"/>
             <w:tcMar>
               <w:top w:w="100.0" w:type="dxa"/>
               <w:left w:w="100.0" w:type="dxa"/>
@@ -14114,6 +14151,7 @@
               <w:bottom w:color="e0e0e0" w:space="0" w:sz="8" w:val="single"/>
               <w:right w:color="ffffff" w:space="0" w:sz="8" w:val="single"/>
             </w:tcBorders>
+            <w:shd w:fill="efefef" w:val="clear"/>
             <w:tcMar>
               <w:top w:w="100.0" w:type="dxa"/>
               <w:left w:w="100.0" w:type="dxa"/>
@@ -14146,6 +14184,7 @@
               <w:bottom w:color="e0e0e0" w:space="0" w:sz="8" w:val="single"/>
               <w:right w:color="ffffff" w:space="0" w:sz="8" w:val="single"/>
             </w:tcBorders>
+            <w:shd w:fill="efefef" w:val="clear"/>
             <w:tcMar>
               <w:top w:w="100.0" w:type="dxa"/>
               <w:left w:w="100.0" w:type="dxa"/>
@@ -14178,6 +14217,7 @@
               <w:bottom w:color="e0e0e0" w:space="0" w:sz="8" w:val="single"/>
               <w:right w:color="ffffff" w:space="0" w:sz="8" w:val="single"/>
             </w:tcBorders>
+            <w:shd w:fill="efefef" w:val="clear"/>
             <w:tcMar>
               <w:top w:w="100.0" w:type="dxa"/>
               <w:left w:w="100.0" w:type="dxa"/>
@@ -14352,6 +14392,7 @@
               <w:bottom w:color="e0e0e0" w:space="0" w:sz="8" w:val="single"/>
               <w:right w:color="ffffff" w:space="0" w:sz="8" w:val="single"/>
             </w:tcBorders>
+            <w:shd w:fill="efefef" w:val="clear"/>
             <w:tcMar>
               <w:top w:w="100.0" w:type="dxa"/>
               <w:left w:w="100.0" w:type="dxa"/>
@@ -14384,6 +14425,7 @@
               <w:bottom w:color="e0e0e0" w:space="0" w:sz="8" w:val="single"/>
               <w:right w:color="ffffff" w:space="0" w:sz="8" w:val="single"/>
             </w:tcBorders>
+            <w:shd w:fill="efefef" w:val="clear"/>
             <w:tcMar>
               <w:top w:w="100.0" w:type="dxa"/>
               <w:left w:w="100.0" w:type="dxa"/>
@@ -14416,6 +14458,7 @@
               <w:bottom w:color="e0e0e0" w:space="0" w:sz="8" w:val="single"/>
               <w:right w:color="ffffff" w:space="0" w:sz="8" w:val="single"/>
             </w:tcBorders>
+            <w:shd w:fill="efefef" w:val="clear"/>
             <w:tcMar>
               <w:top w:w="100.0" w:type="dxa"/>
               <w:left w:w="100.0" w:type="dxa"/>
@@ -14448,6 +14491,7 @@
               <w:bottom w:color="e0e0e0" w:space="0" w:sz="8" w:val="single"/>
               <w:right w:color="ffffff" w:space="0" w:sz="8" w:val="single"/>
             </w:tcBorders>
+            <w:shd w:fill="efefef" w:val="clear"/>
             <w:tcMar>
               <w:top w:w="100.0" w:type="dxa"/>
               <w:left w:w="100.0" w:type="dxa"/>
@@ -14622,6 +14666,7 @@
               <w:bottom w:color="e0e0e0" w:space="0" w:sz="8" w:val="single"/>
               <w:right w:color="ffffff" w:space="0" w:sz="8" w:val="single"/>
             </w:tcBorders>
+            <w:shd w:fill="efefef" w:val="clear"/>
             <w:tcMar>
               <w:top w:w="100.0" w:type="dxa"/>
               <w:left w:w="100.0" w:type="dxa"/>
@@ -14654,6 +14699,7 @@
               <w:bottom w:color="e0e0e0" w:space="0" w:sz="8" w:val="single"/>
               <w:right w:color="ffffff" w:space="0" w:sz="8" w:val="single"/>
             </w:tcBorders>
+            <w:shd w:fill="efefef" w:val="clear"/>
             <w:tcMar>
               <w:top w:w="100.0" w:type="dxa"/>
               <w:left w:w="100.0" w:type="dxa"/>
@@ -14686,6 +14732,7 @@
               <w:bottom w:color="e0e0e0" w:space="0" w:sz="8" w:val="single"/>
               <w:right w:color="ffffff" w:space="0" w:sz="8" w:val="single"/>
             </w:tcBorders>
+            <w:shd w:fill="efefef" w:val="clear"/>
             <w:tcMar>
               <w:top w:w="100.0" w:type="dxa"/>
               <w:left w:w="100.0" w:type="dxa"/>
@@ -14718,6 +14765,7 @@
               <w:bottom w:color="e0e0e0" w:space="0" w:sz="8" w:val="single"/>
               <w:right w:color="ffffff" w:space="0" w:sz="8" w:val="single"/>
             </w:tcBorders>
+            <w:shd w:fill="efefef" w:val="clear"/>
             <w:tcMar>
               <w:top w:w="100.0" w:type="dxa"/>
               <w:left w:w="100.0" w:type="dxa"/>
@@ -14892,6 +14940,7 @@
               <w:bottom w:color="e0e0e0" w:space="0" w:sz="8" w:val="single"/>
               <w:right w:color="ffffff" w:space="0" w:sz="8" w:val="single"/>
             </w:tcBorders>
+            <w:shd w:fill="efefef" w:val="clear"/>
             <w:tcMar>
               <w:top w:w="100.0" w:type="dxa"/>
               <w:left w:w="100.0" w:type="dxa"/>
@@ -14924,6 +14973,7 @@
               <w:bottom w:color="e0e0e0" w:space="0" w:sz="8" w:val="single"/>
               <w:right w:color="ffffff" w:space="0" w:sz="8" w:val="single"/>
             </w:tcBorders>
+            <w:shd w:fill="efefef" w:val="clear"/>
             <w:tcMar>
               <w:top w:w="100.0" w:type="dxa"/>
               <w:left w:w="100.0" w:type="dxa"/>
@@ -14956,6 +15006,7 @@
               <w:bottom w:color="e0e0e0" w:space="0" w:sz="8" w:val="single"/>
               <w:right w:color="ffffff" w:space="0" w:sz="8" w:val="single"/>
             </w:tcBorders>
+            <w:shd w:fill="efefef" w:val="clear"/>
             <w:tcMar>
               <w:top w:w="100.0" w:type="dxa"/>
               <w:left w:w="100.0" w:type="dxa"/>
@@ -14988,6 +15039,7 @@
               <w:bottom w:color="e0e0e0" w:space="0" w:sz="8" w:val="single"/>
               <w:right w:color="ffffff" w:space="0" w:sz="8" w:val="single"/>
             </w:tcBorders>
+            <w:shd w:fill="efefef" w:val="clear"/>
             <w:tcMar>
               <w:top w:w="100.0" w:type="dxa"/>
               <w:left w:w="100.0" w:type="dxa"/>
@@ -15162,6 +15214,7 @@
               <w:bottom w:color="e0e0e0" w:space="0" w:sz="8" w:val="single"/>
               <w:right w:color="ffffff" w:space="0" w:sz="8" w:val="single"/>
             </w:tcBorders>
+            <w:shd w:fill="efefef" w:val="clear"/>
             <w:tcMar>
               <w:top w:w="100.0" w:type="dxa"/>
               <w:left w:w="100.0" w:type="dxa"/>
@@ -15194,6 +15247,7 @@
               <w:bottom w:color="e0e0e0" w:space="0" w:sz="8" w:val="single"/>
               <w:right w:color="ffffff" w:space="0" w:sz="8" w:val="single"/>
             </w:tcBorders>
+            <w:shd w:fill="efefef" w:val="clear"/>
             <w:tcMar>
               <w:top w:w="100.0" w:type="dxa"/>
               <w:left w:w="100.0" w:type="dxa"/>
@@ -15226,6 +15280,7 @@
               <w:bottom w:color="e0e0e0" w:space="0" w:sz="8" w:val="single"/>
               <w:right w:color="ffffff" w:space="0" w:sz="8" w:val="single"/>
             </w:tcBorders>
+            <w:shd w:fill="efefef" w:val="clear"/>
             <w:tcMar>
               <w:top w:w="100.0" w:type="dxa"/>
               <w:left w:w="100.0" w:type="dxa"/>
@@ -15258,6 +15313,7 @@
               <w:bottom w:color="e0e0e0" w:space="0" w:sz="8" w:val="single"/>
               <w:right w:color="ffffff" w:space="0" w:sz="8" w:val="single"/>
             </w:tcBorders>
+            <w:shd w:fill="efefef" w:val="clear"/>
             <w:tcMar>
               <w:top w:w="100.0" w:type="dxa"/>
               <w:left w:w="100.0" w:type="dxa"/>
@@ -15432,6 +15488,7 @@
               <w:bottom w:color="e0e0e0" w:space="0" w:sz="8" w:val="single"/>
               <w:right w:color="ffffff" w:space="0" w:sz="8" w:val="single"/>
             </w:tcBorders>
+            <w:shd w:fill="efefef" w:val="clear"/>
             <w:tcMar>
               <w:top w:w="100.0" w:type="dxa"/>
               <w:left w:w="100.0" w:type="dxa"/>
@@ -15464,6 +15521,7 @@
               <w:bottom w:color="e0e0e0" w:space="0" w:sz="8" w:val="single"/>
               <w:right w:color="ffffff" w:space="0" w:sz="8" w:val="single"/>
             </w:tcBorders>
+            <w:shd w:fill="efefef" w:val="clear"/>
             <w:tcMar>
               <w:top w:w="100.0" w:type="dxa"/>
               <w:left w:w="100.0" w:type="dxa"/>
@@ -15496,6 +15554,7 @@
               <w:bottom w:color="e0e0e0" w:space="0" w:sz="8" w:val="single"/>
               <w:right w:color="ffffff" w:space="0" w:sz="8" w:val="single"/>
             </w:tcBorders>
+            <w:shd w:fill="efefef" w:val="clear"/>
             <w:tcMar>
               <w:top w:w="100.0" w:type="dxa"/>
               <w:left w:w="100.0" w:type="dxa"/>
@@ -15528,6 +15587,7 @@
               <w:bottom w:color="e0e0e0" w:space="0" w:sz="8" w:val="single"/>
               <w:right w:color="ffffff" w:space="0" w:sz="8" w:val="single"/>
             </w:tcBorders>
+            <w:shd w:fill="efefef" w:val="clear"/>
             <w:tcMar>
               <w:top w:w="100.0" w:type="dxa"/>
               <w:left w:w="100.0" w:type="dxa"/>
@@ -15587,7 +15647,7 @@
                 <w:rFonts w:ascii="Proxima Nova" w:cs="Proxima Nova" w:eastAsia="Proxima Nova" w:hAnsi="Proxima Nova"/>
                 <w:rtl w:val="0"/>
               </w:rPr>
-              <w:t xml:space="preserve">Evolución</w:t>
+              <w:t xml:space="preserve">Soporte</w:t>
             </w:r>
           </w:p>
         </w:tc>
@@ -15663,6 +15723,145 @@
               <w:bottom w:color="e0e0e0" w:space="0" w:sz="8" w:val="single"/>
               <w:right w:color="ffffff" w:space="0" w:sz="8" w:val="single"/>
             </w:tcBorders>
+            <w:tcMar>
+              <w:top w:w="100.0" w:type="dxa"/>
+              <w:left w:w="100.0" w:type="dxa"/>
+              <w:bottom w:w="100.0" w:type="dxa"/>
+              <w:right w:w="100.0" w:type="dxa"/>
+            </w:tcMar>
+            <w:vAlign w:val="top"/>
+          </w:tcPr>
+          <w:p>
+            <w:pPr>
+              <w:spacing w:after="0" w:line="240" w:lineRule="auto"/>
+              <w:rPr>
+                <w:rFonts w:ascii="Proxima Nova" w:cs="Proxima Nova" w:eastAsia="Proxima Nova" w:hAnsi="Proxima Nova"/>
+              </w:rPr>
+            </w:pPr>
+            <w:r>
+              <w:rPr>
+                <w:rFonts w:ascii="Proxima Nova" w:cs="Proxima Nova" w:eastAsia="Proxima Nova" w:hAnsi="Proxima Nova"/>
+                <w:rtl w:val="0"/>
+              </w:rPr>
+              <w:t xml:space="preserve">SISCOP</w:t>
+            </w:r>
+          </w:p>
+        </w:tc>
+      </w:tr>
+      <w:tr>
+        <w:trPr>
+          <w:cantSplit w:val="0"/>
+          <w:trHeight w:val="500" w:hRule="atLeast"/>
+          <w:tblHeader w:val="0"/>
+        </w:trPr>
+        <w:tc>
+          <w:tcPr>
+            <w:tcBorders>
+              <w:top w:color="e0e0e0" w:space="0" w:sz="8" w:val="single"/>
+              <w:left w:color="ffffff" w:space="0" w:sz="8" w:val="single"/>
+              <w:bottom w:color="e0e0e0" w:space="0" w:sz="8" w:val="single"/>
+              <w:right w:color="ffffff" w:space="0" w:sz="8" w:val="single"/>
+            </w:tcBorders>
+            <w:shd w:fill="efefef" w:val="clear"/>
+            <w:tcMar>
+              <w:top w:w="100.0" w:type="dxa"/>
+              <w:left w:w="100.0" w:type="dxa"/>
+              <w:bottom w:w="100.0" w:type="dxa"/>
+              <w:right w:w="100.0" w:type="dxa"/>
+            </w:tcMar>
+            <w:vAlign w:val="top"/>
+          </w:tcPr>
+          <w:p>
+            <w:pPr>
+              <w:spacing w:after="0" w:line="240" w:lineRule="auto"/>
+              <w:rPr>
+                <w:rFonts w:ascii="Proxima Nova" w:cs="Proxima Nova" w:eastAsia="Proxima Nova" w:hAnsi="Proxima Nova"/>
+              </w:rPr>
+            </w:pPr>
+            <w:r>
+              <w:rPr>
+                <w:rFonts w:ascii="Proxima Nova" w:cs="Proxima Nova" w:eastAsia="Proxima Nova" w:hAnsi="Proxima Nova"/>
+                <w:rtl w:val="0"/>
+              </w:rPr>
+              <w:t xml:space="preserve">Soporte</w:t>
+            </w:r>
+          </w:p>
+        </w:tc>
+        <w:tc>
+          <w:tcPr>
+            <w:tcBorders>
+              <w:top w:color="e0e0e0" w:space="0" w:sz="8" w:val="single"/>
+              <w:left w:color="ffffff" w:space="0" w:sz="8" w:val="single"/>
+              <w:bottom w:color="e0e0e0" w:space="0" w:sz="8" w:val="single"/>
+              <w:right w:color="ffffff" w:space="0" w:sz="8" w:val="single"/>
+            </w:tcBorders>
+            <w:shd w:fill="efefef" w:val="clear"/>
+            <w:tcMar>
+              <w:top w:w="100.0" w:type="dxa"/>
+              <w:left w:w="100.0" w:type="dxa"/>
+              <w:bottom w:w="100.0" w:type="dxa"/>
+              <w:right w:w="100.0" w:type="dxa"/>
+            </w:tcMar>
+            <w:vAlign w:val="top"/>
+          </w:tcPr>
+          <w:p>
+            <w:pPr>
+              <w:spacing w:after="0" w:line="240" w:lineRule="auto"/>
+              <w:rPr>
+                <w:rFonts w:ascii="Proxima Nova" w:cs="Proxima Nova" w:eastAsia="Proxima Nova" w:hAnsi="Proxima Nova"/>
+              </w:rPr>
+            </w:pPr>
+            <w:r>
+              <w:rPr>
+                <w:rFonts w:ascii="Proxima Nova" w:cs="Proxima Nova" w:eastAsia="Proxima Nova" w:hAnsi="Proxima Nova"/>
+                <w:rtl w:val="0"/>
+              </w:rPr>
+              <w:t xml:space="preserve">Reporte de pruebas funcionales</w:t>
+            </w:r>
+          </w:p>
+        </w:tc>
+        <w:tc>
+          <w:tcPr>
+            <w:tcBorders>
+              <w:top w:color="e0e0e0" w:space="0" w:sz="8" w:val="single"/>
+              <w:left w:color="ffffff" w:space="0" w:sz="8" w:val="single"/>
+              <w:bottom w:color="e0e0e0" w:space="0" w:sz="8" w:val="single"/>
+              <w:right w:color="ffffff" w:space="0" w:sz="8" w:val="single"/>
+            </w:tcBorders>
+            <w:shd w:fill="efefef" w:val="clear"/>
+            <w:tcMar>
+              <w:top w:w="100.0" w:type="dxa"/>
+              <w:left w:w="100.0" w:type="dxa"/>
+              <w:bottom w:w="100.0" w:type="dxa"/>
+              <w:right w:w="100.0" w:type="dxa"/>
+            </w:tcMar>
+            <w:vAlign w:val="top"/>
+          </w:tcPr>
+          <w:p>
+            <w:pPr>
+              <w:spacing w:after="0" w:line="240" w:lineRule="auto"/>
+              <w:rPr>
+                <w:rFonts w:ascii="Proxima Nova" w:cs="Proxima Nova" w:eastAsia="Proxima Nova" w:hAnsi="Proxima Nova"/>
+              </w:rPr>
+            </w:pPr>
+            <w:r>
+              <w:rPr>
+                <w:rFonts w:ascii="Proxima Nova" w:cs="Proxima Nova" w:eastAsia="Proxima Nova" w:hAnsi="Proxima Nova"/>
+                <w:rtl w:val="0"/>
+              </w:rPr>
+              <w:t xml:space="preserve">SISCOP-RPF.docx</w:t>
+            </w:r>
+          </w:p>
+        </w:tc>
+        <w:tc>
+          <w:tcPr>
+            <w:tcBorders>
+              <w:top w:color="e0e0e0" w:space="0" w:sz="8" w:val="single"/>
+              <w:left w:color="ffffff" w:space="0" w:sz="8" w:val="single"/>
+              <w:bottom w:color="e0e0e0" w:space="0" w:sz="8" w:val="single"/>
+              <w:right w:color="ffffff" w:space="0" w:sz="8" w:val="single"/>
+            </w:tcBorders>
+            <w:shd w:fill="efefef" w:val="clear"/>
             <w:tcMar>
               <w:top w:w="100.0" w:type="dxa"/>
               <w:left w:w="100.0" w:type="dxa"/>
@@ -15722,7 +15921,7 @@
                 <w:rFonts w:ascii="Proxima Nova" w:cs="Proxima Nova" w:eastAsia="Proxima Nova" w:hAnsi="Proxima Nova"/>
                 <w:rtl w:val="0"/>
               </w:rPr>
-              <w:t xml:space="preserve">Evolución</w:t>
+              <w:t xml:space="preserve">Soporte</w:t>
             </w:r>
           </w:p>
         </w:tc>
@@ -15754,7 +15953,7 @@
                 <w:rFonts w:ascii="Proxima Nova" w:cs="Proxima Nova" w:eastAsia="Proxima Nova" w:hAnsi="Proxima Nova"/>
                 <w:rtl w:val="0"/>
               </w:rPr>
-              <w:t xml:space="preserve">Reporte de pruebas funcionales</w:t>
+              <w:t xml:space="preserve">Reporte de corrección de errores</w:t>
             </w:r>
           </w:p>
         </w:tc>
@@ -15786,7 +15985,7 @@
                 <w:rFonts w:ascii="Proxima Nova" w:cs="Proxima Nova" w:eastAsia="Proxima Nova" w:hAnsi="Proxima Nova"/>
                 <w:rtl w:val="0"/>
               </w:rPr>
-              <w:t xml:space="preserve">SISCOP-RPF.docx</w:t>
+              <w:t xml:space="preserve">SISCOP-RCE.docx</w:t>
             </w:r>
           </w:p>
         </w:tc>
@@ -15798,6 +15997,145 @@
               <w:bottom w:color="e0e0e0" w:space="0" w:sz="8" w:val="single"/>
               <w:right w:color="ffffff" w:space="0" w:sz="8" w:val="single"/>
             </w:tcBorders>
+            <w:tcMar>
+              <w:top w:w="100.0" w:type="dxa"/>
+              <w:left w:w="100.0" w:type="dxa"/>
+              <w:bottom w:w="100.0" w:type="dxa"/>
+              <w:right w:w="100.0" w:type="dxa"/>
+            </w:tcMar>
+            <w:vAlign w:val="top"/>
+          </w:tcPr>
+          <w:p>
+            <w:pPr>
+              <w:spacing w:after="0" w:line="240" w:lineRule="auto"/>
+              <w:rPr>
+                <w:rFonts w:ascii="Proxima Nova" w:cs="Proxima Nova" w:eastAsia="Proxima Nova" w:hAnsi="Proxima Nova"/>
+              </w:rPr>
+            </w:pPr>
+            <w:r>
+              <w:rPr>
+                <w:rFonts w:ascii="Proxima Nova" w:cs="Proxima Nova" w:eastAsia="Proxima Nova" w:hAnsi="Proxima Nova"/>
+                <w:rtl w:val="0"/>
+              </w:rPr>
+              <w:t xml:space="preserve">SISCOP</w:t>
+            </w:r>
+          </w:p>
+        </w:tc>
+      </w:tr>
+      <w:tr>
+        <w:trPr>
+          <w:cantSplit w:val="0"/>
+          <w:trHeight w:val="500" w:hRule="atLeast"/>
+          <w:tblHeader w:val="0"/>
+        </w:trPr>
+        <w:tc>
+          <w:tcPr>
+            <w:tcBorders>
+              <w:top w:color="e0e0e0" w:space="0" w:sz="8" w:val="single"/>
+              <w:left w:color="ffffff" w:space="0" w:sz="8" w:val="single"/>
+              <w:bottom w:color="e0e0e0" w:space="0" w:sz="8" w:val="single"/>
+              <w:right w:color="ffffff" w:space="0" w:sz="8" w:val="single"/>
+            </w:tcBorders>
+            <w:shd w:fill="efefef" w:val="clear"/>
+            <w:tcMar>
+              <w:top w:w="100.0" w:type="dxa"/>
+              <w:left w:w="100.0" w:type="dxa"/>
+              <w:bottom w:w="100.0" w:type="dxa"/>
+              <w:right w:w="100.0" w:type="dxa"/>
+            </w:tcMar>
+            <w:vAlign w:val="top"/>
+          </w:tcPr>
+          <w:p>
+            <w:pPr>
+              <w:spacing w:after="0" w:line="240" w:lineRule="auto"/>
+              <w:rPr>
+                <w:rFonts w:ascii="Proxima Nova" w:cs="Proxima Nova" w:eastAsia="Proxima Nova" w:hAnsi="Proxima Nova"/>
+              </w:rPr>
+            </w:pPr>
+            <w:r>
+              <w:rPr>
+                <w:rFonts w:ascii="Proxima Nova" w:cs="Proxima Nova" w:eastAsia="Proxima Nova" w:hAnsi="Proxima Nova"/>
+                <w:rtl w:val="0"/>
+              </w:rPr>
+              <w:t xml:space="preserve">Soporte</w:t>
+            </w:r>
+          </w:p>
+        </w:tc>
+        <w:tc>
+          <w:tcPr>
+            <w:tcBorders>
+              <w:top w:color="e0e0e0" w:space="0" w:sz="8" w:val="single"/>
+              <w:left w:color="ffffff" w:space="0" w:sz="8" w:val="single"/>
+              <w:bottom w:color="e0e0e0" w:space="0" w:sz="8" w:val="single"/>
+              <w:right w:color="ffffff" w:space="0" w:sz="8" w:val="single"/>
+            </w:tcBorders>
+            <w:shd w:fill="efefef" w:val="clear"/>
+            <w:tcMar>
+              <w:top w:w="100.0" w:type="dxa"/>
+              <w:left w:w="100.0" w:type="dxa"/>
+              <w:bottom w:w="100.0" w:type="dxa"/>
+              <w:right w:w="100.0" w:type="dxa"/>
+            </w:tcMar>
+            <w:vAlign w:val="top"/>
+          </w:tcPr>
+          <w:p>
+            <w:pPr>
+              <w:spacing w:after="0" w:line="240" w:lineRule="auto"/>
+              <w:rPr>
+                <w:rFonts w:ascii="Proxima Nova" w:cs="Proxima Nova" w:eastAsia="Proxima Nova" w:hAnsi="Proxima Nova"/>
+              </w:rPr>
+            </w:pPr>
+            <w:r>
+              <w:rPr>
+                <w:rFonts w:ascii="Proxima Nova" w:cs="Proxima Nova" w:eastAsia="Proxima Nova" w:hAnsi="Proxima Nova"/>
+                <w:rtl w:val="0"/>
+              </w:rPr>
+              <w:t xml:space="preserve">Reporte de validación final</w:t>
+            </w:r>
+          </w:p>
+        </w:tc>
+        <w:tc>
+          <w:tcPr>
+            <w:tcBorders>
+              <w:top w:color="e0e0e0" w:space="0" w:sz="8" w:val="single"/>
+              <w:left w:color="ffffff" w:space="0" w:sz="8" w:val="single"/>
+              <w:bottom w:color="e0e0e0" w:space="0" w:sz="8" w:val="single"/>
+              <w:right w:color="ffffff" w:space="0" w:sz="8" w:val="single"/>
+            </w:tcBorders>
+            <w:shd w:fill="efefef" w:val="clear"/>
+            <w:tcMar>
+              <w:top w:w="100.0" w:type="dxa"/>
+              <w:left w:w="100.0" w:type="dxa"/>
+              <w:bottom w:w="100.0" w:type="dxa"/>
+              <w:right w:w="100.0" w:type="dxa"/>
+            </w:tcMar>
+            <w:vAlign w:val="top"/>
+          </w:tcPr>
+          <w:p>
+            <w:pPr>
+              <w:spacing w:after="0" w:line="240" w:lineRule="auto"/>
+              <w:rPr>
+                <w:rFonts w:ascii="Proxima Nova" w:cs="Proxima Nova" w:eastAsia="Proxima Nova" w:hAnsi="Proxima Nova"/>
+              </w:rPr>
+            </w:pPr>
+            <w:r>
+              <w:rPr>
+                <w:rFonts w:ascii="Proxima Nova" w:cs="Proxima Nova" w:eastAsia="Proxima Nova" w:hAnsi="Proxima Nova"/>
+                <w:rtl w:val="0"/>
+              </w:rPr>
+              <w:t xml:space="preserve">SISCOP-RVF.docx</w:t>
+            </w:r>
+          </w:p>
+        </w:tc>
+        <w:tc>
+          <w:tcPr>
+            <w:tcBorders>
+              <w:top w:color="e0e0e0" w:space="0" w:sz="8" w:val="single"/>
+              <w:left w:color="ffffff" w:space="0" w:sz="8" w:val="single"/>
+              <w:bottom w:color="e0e0e0" w:space="0" w:sz="8" w:val="single"/>
+              <w:right w:color="ffffff" w:space="0" w:sz="8" w:val="single"/>
+            </w:tcBorders>
+            <w:shd w:fill="efefef" w:val="clear"/>
             <w:tcMar>
               <w:top w:w="100.0" w:type="dxa"/>
               <w:left w:w="100.0" w:type="dxa"/>
@@ -15857,277 +16195,7 @@
                 <w:rFonts w:ascii="Proxima Nova" w:cs="Proxima Nova" w:eastAsia="Proxima Nova" w:hAnsi="Proxima Nova"/>
                 <w:rtl w:val="0"/>
               </w:rPr>
-              <w:t xml:space="preserve">Evolución</w:t>
-            </w:r>
-          </w:p>
-        </w:tc>
-        <w:tc>
-          <w:tcPr>
-            <w:tcBorders>
-              <w:top w:color="e0e0e0" w:space="0" w:sz="8" w:val="single"/>
-              <w:left w:color="ffffff" w:space="0" w:sz="8" w:val="single"/>
-              <w:bottom w:color="e0e0e0" w:space="0" w:sz="8" w:val="single"/>
-              <w:right w:color="ffffff" w:space="0" w:sz="8" w:val="single"/>
-            </w:tcBorders>
-            <w:tcMar>
-              <w:top w:w="100.0" w:type="dxa"/>
-              <w:left w:w="100.0" w:type="dxa"/>
-              <w:bottom w:w="100.0" w:type="dxa"/>
-              <w:right w:w="100.0" w:type="dxa"/>
-            </w:tcMar>
-            <w:vAlign w:val="top"/>
-          </w:tcPr>
-          <w:p>
-            <w:pPr>
-              <w:spacing w:after="0" w:line="240" w:lineRule="auto"/>
-              <w:rPr>
-                <w:rFonts w:ascii="Proxima Nova" w:cs="Proxima Nova" w:eastAsia="Proxima Nova" w:hAnsi="Proxima Nova"/>
-              </w:rPr>
-            </w:pPr>
-            <w:r>
-              <w:rPr>
-                <w:rFonts w:ascii="Proxima Nova" w:cs="Proxima Nova" w:eastAsia="Proxima Nova" w:hAnsi="Proxima Nova"/>
-                <w:rtl w:val="0"/>
-              </w:rPr>
-              <w:t xml:space="preserve">Reporte de corrección de errores</w:t>
-            </w:r>
-          </w:p>
-        </w:tc>
-        <w:tc>
-          <w:tcPr>
-            <w:tcBorders>
-              <w:top w:color="e0e0e0" w:space="0" w:sz="8" w:val="single"/>
-              <w:left w:color="ffffff" w:space="0" w:sz="8" w:val="single"/>
-              <w:bottom w:color="e0e0e0" w:space="0" w:sz="8" w:val="single"/>
-              <w:right w:color="ffffff" w:space="0" w:sz="8" w:val="single"/>
-            </w:tcBorders>
-            <w:tcMar>
-              <w:top w:w="100.0" w:type="dxa"/>
-              <w:left w:w="100.0" w:type="dxa"/>
-              <w:bottom w:w="100.0" w:type="dxa"/>
-              <w:right w:w="100.0" w:type="dxa"/>
-            </w:tcMar>
-            <w:vAlign w:val="top"/>
-          </w:tcPr>
-          <w:p>
-            <w:pPr>
-              <w:spacing w:after="0" w:line="240" w:lineRule="auto"/>
-              <w:rPr>
-                <w:rFonts w:ascii="Proxima Nova" w:cs="Proxima Nova" w:eastAsia="Proxima Nova" w:hAnsi="Proxima Nova"/>
-              </w:rPr>
-            </w:pPr>
-            <w:r>
-              <w:rPr>
-                <w:rFonts w:ascii="Proxima Nova" w:cs="Proxima Nova" w:eastAsia="Proxima Nova" w:hAnsi="Proxima Nova"/>
-                <w:rtl w:val="0"/>
-              </w:rPr>
-              <w:t xml:space="preserve">SISCOP-RCE.docx</w:t>
-            </w:r>
-          </w:p>
-        </w:tc>
-        <w:tc>
-          <w:tcPr>
-            <w:tcBorders>
-              <w:top w:color="e0e0e0" w:space="0" w:sz="8" w:val="single"/>
-              <w:left w:color="ffffff" w:space="0" w:sz="8" w:val="single"/>
-              <w:bottom w:color="e0e0e0" w:space="0" w:sz="8" w:val="single"/>
-              <w:right w:color="ffffff" w:space="0" w:sz="8" w:val="single"/>
-            </w:tcBorders>
-            <w:tcMar>
-              <w:top w:w="100.0" w:type="dxa"/>
-              <w:left w:w="100.0" w:type="dxa"/>
-              <w:bottom w:w="100.0" w:type="dxa"/>
-              <w:right w:w="100.0" w:type="dxa"/>
-            </w:tcMar>
-            <w:vAlign w:val="top"/>
-          </w:tcPr>
-          <w:p>
-            <w:pPr>
-              <w:spacing w:after="0" w:line="240" w:lineRule="auto"/>
-              <w:rPr>
-                <w:rFonts w:ascii="Proxima Nova" w:cs="Proxima Nova" w:eastAsia="Proxima Nova" w:hAnsi="Proxima Nova"/>
-              </w:rPr>
-            </w:pPr>
-            <w:r>
-              <w:rPr>
-                <w:rFonts w:ascii="Proxima Nova" w:cs="Proxima Nova" w:eastAsia="Proxima Nova" w:hAnsi="Proxima Nova"/>
-                <w:rtl w:val="0"/>
-              </w:rPr>
-              <w:t xml:space="preserve">SISCOP</w:t>
-            </w:r>
-          </w:p>
-        </w:tc>
-      </w:tr>
-      <w:tr>
-        <w:trPr>
-          <w:cantSplit w:val="0"/>
-          <w:trHeight w:val="500" w:hRule="atLeast"/>
-          <w:tblHeader w:val="0"/>
-        </w:trPr>
-        <w:tc>
-          <w:tcPr>
-            <w:tcBorders>
-              <w:top w:color="e0e0e0" w:space="0" w:sz="8" w:val="single"/>
-              <w:left w:color="ffffff" w:space="0" w:sz="8" w:val="single"/>
-              <w:bottom w:color="e0e0e0" w:space="0" w:sz="8" w:val="single"/>
-              <w:right w:color="ffffff" w:space="0" w:sz="8" w:val="single"/>
-            </w:tcBorders>
-            <w:tcMar>
-              <w:top w:w="100.0" w:type="dxa"/>
-              <w:left w:w="100.0" w:type="dxa"/>
-              <w:bottom w:w="100.0" w:type="dxa"/>
-              <w:right w:w="100.0" w:type="dxa"/>
-            </w:tcMar>
-            <w:vAlign w:val="top"/>
-          </w:tcPr>
-          <w:p>
-            <w:pPr>
-              <w:spacing w:after="0" w:line="240" w:lineRule="auto"/>
-              <w:rPr>
-                <w:rFonts w:ascii="Proxima Nova" w:cs="Proxima Nova" w:eastAsia="Proxima Nova" w:hAnsi="Proxima Nova"/>
-              </w:rPr>
-            </w:pPr>
-            <w:r>
-              <w:rPr>
-                <w:rFonts w:ascii="Proxima Nova" w:cs="Proxima Nova" w:eastAsia="Proxima Nova" w:hAnsi="Proxima Nova"/>
-                <w:rtl w:val="0"/>
-              </w:rPr>
-              <w:t xml:space="preserve">Evolución</w:t>
-            </w:r>
-          </w:p>
-        </w:tc>
-        <w:tc>
-          <w:tcPr>
-            <w:tcBorders>
-              <w:top w:color="e0e0e0" w:space="0" w:sz="8" w:val="single"/>
-              <w:left w:color="ffffff" w:space="0" w:sz="8" w:val="single"/>
-              <w:bottom w:color="e0e0e0" w:space="0" w:sz="8" w:val="single"/>
-              <w:right w:color="ffffff" w:space="0" w:sz="8" w:val="single"/>
-            </w:tcBorders>
-            <w:tcMar>
-              <w:top w:w="100.0" w:type="dxa"/>
-              <w:left w:w="100.0" w:type="dxa"/>
-              <w:bottom w:w="100.0" w:type="dxa"/>
-              <w:right w:w="100.0" w:type="dxa"/>
-            </w:tcMar>
-            <w:vAlign w:val="top"/>
-          </w:tcPr>
-          <w:p>
-            <w:pPr>
-              <w:spacing w:after="0" w:line="240" w:lineRule="auto"/>
-              <w:rPr>
-                <w:rFonts w:ascii="Proxima Nova" w:cs="Proxima Nova" w:eastAsia="Proxima Nova" w:hAnsi="Proxima Nova"/>
-              </w:rPr>
-            </w:pPr>
-            <w:r>
-              <w:rPr>
-                <w:rFonts w:ascii="Proxima Nova" w:cs="Proxima Nova" w:eastAsia="Proxima Nova" w:hAnsi="Proxima Nova"/>
-                <w:rtl w:val="0"/>
-              </w:rPr>
-              <w:t xml:space="preserve">Reporte de validación final</w:t>
-            </w:r>
-          </w:p>
-        </w:tc>
-        <w:tc>
-          <w:tcPr>
-            <w:tcBorders>
-              <w:top w:color="e0e0e0" w:space="0" w:sz="8" w:val="single"/>
-              <w:left w:color="ffffff" w:space="0" w:sz="8" w:val="single"/>
-              <w:bottom w:color="e0e0e0" w:space="0" w:sz="8" w:val="single"/>
-              <w:right w:color="ffffff" w:space="0" w:sz="8" w:val="single"/>
-            </w:tcBorders>
-            <w:tcMar>
-              <w:top w:w="100.0" w:type="dxa"/>
-              <w:left w:w="100.0" w:type="dxa"/>
-              <w:bottom w:w="100.0" w:type="dxa"/>
-              <w:right w:w="100.0" w:type="dxa"/>
-            </w:tcMar>
-            <w:vAlign w:val="top"/>
-          </w:tcPr>
-          <w:p>
-            <w:pPr>
-              <w:spacing w:after="0" w:line="240" w:lineRule="auto"/>
-              <w:rPr>
-                <w:rFonts w:ascii="Proxima Nova" w:cs="Proxima Nova" w:eastAsia="Proxima Nova" w:hAnsi="Proxima Nova"/>
-              </w:rPr>
-            </w:pPr>
-            <w:r>
-              <w:rPr>
-                <w:rFonts w:ascii="Proxima Nova" w:cs="Proxima Nova" w:eastAsia="Proxima Nova" w:hAnsi="Proxima Nova"/>
-                <w:rtl w:val="0"/>
-              </w:rPr>
-              <w:t xml:space="preserve">SISCOP-RVF.docx</w:t>
-            </w:r>
-          </w:p>
-        </w:tc>
-        <w:tc>
-          <w:tcPr>
-            <w:tcBorders>
-              <w:top w:color="e0e0e0" w:space="0" w:sz="8" w:val="single"/>
-              <w:left w:color="ffffff" w:space="0" w:sz="8" w:val="single"/>
-              <w:bottom w:color="e0e0e0" w:space="0" w:sz="8" w:val="single"/>
-              <w:right w:color="ffffff" w:space="0" w:sz="8" w:val="single"/>
-            </w:tcBorders>
-            <w:tcMar>
-              <w:top w:w="100.0" w:type="dxa"/>
-              <w:left w:w="100.0" w:type="dxa"/>
-              <w:bottom w:w="100.0" w:type="dxa"/>
-              <w:right w:w="100.0" w:type="dxa"/>
-            </w:tcMar>
-            <w:vAlign w:val="top"/>
-          </w:tcPr>
-          <w:p>
-            <w:pPr>
-              <w:spacing w:after="0" w:line="240" w:lineRule="auto"/>
-              <w:rPr>
-                <w:rFonts w:ascii="Proxima Nova" w:cs="Proxima Nova" w:eastAsia="Proxima Nova" w:hAnsi="Proxima Nova"/>
-              </w:rPr>
-            </w:pPr>
-            <w:r>
-              <w:rPr>
-                <w:rFonts w:ascii="Proxima Nova" w:cs="Proxima Nova" w:eastAsia="Proxima Nova" w:hAnsi="Proxima Nova"/>
-                <w:rtl w:val="0"/>
-              </w:rPr>
-              <w:t xml:space="preserve">SISCOP</w:t>
-            </w:r>
-          </w:p>
-        </w:tc>
-      </w:tr>
-      <w:tr>
-        <w:trPr>
-          <w:cantSplit w:val="0"/>
-          <w:trHeight w:val="500" w:hRule="atLeast"/>
-          <w:tblHeader w:val="0"/>
-        </w:trPr>
-        <w:tc>
-          <w:tcPr>
-            <w:tcBorders>
-              <w:top w:color="e0e0e0" w:space="0" w:sz="8" w:val="single"/>
-              <w:left w:color="ffffff" w:space="0" w:sz="8" w:val="single"/>
-              <w:bottom w:color="e0e0e0" w:space="0" w:sz="8" w:val="single"/>
-              <w:right w:color="ffffff" w:space="0" w:sz="8" w:val="single"/>
-            </w:tcBorders>
-            <w:tcMar>
-              <w:top w:w="100.0" w:type="dxa"/>
-              <w:left w:w="100.0" w:type="dxa"/>
-              <w:bottom w:w="100.0" w:type="dxa"/>
-              <w:right w:w="100.0" w:type="dxa"/>
-            </w:tcMar>
-            <w:vAlign w:val="top"/>
-          </w:tcPr>
-          <w:p>
-            <w:pPr>
-              <w:spacing w:after="0" w:line="240" w:lineRule="auto"/>
-              <w:rPr>
-                <w:rFonts w:ascii="Proxima Nova" w:cs="Proxima Nova" w:eastAsia="Proxima Nova" w:hAnsi="Proxima Nova"/>
-              </w:rPr>
-            </w:pPr>
-            <w:r>
-              <w:rPr>
-                <w:rFonts w:ascii="Proxima Nova" w:cs="Proxima Nova" w:eastAsia="Proxima Nova" w:hAnsi="Proxima Nova"/>
-                <w:rtl w:val="0"/>
-              </w:rPr>
-              <w:t xml:space="preserve">Evolución</w:t>
+              <w:t xml:space="preserve">Soporte</w:t>
             </w:r>
           </w:p>
         </w:tc>
@@ -16242,6 +16310,7 @@
               <w:bottom w:color="00aee4" w:space="0" w:sz="4" w:val="single"/>
               <w:right w:color="ffffff" w:space="0" w:sz="8" w:val="single"/>
             </w:tcBorders>
+            <w:shd w:fill="efefef" w:val="clear"/>
             <w:tcMar>
               <w:top w:w="100.0" w:type="dxa"/>
               <w:left w:w="100.0" w:type="dxa"/>
@@ -16262,7 +16331,7 @@
                 <w:rFonts w:ascii="Proxima Nova" w:cs="Proxima Nova" w:eastAsia="Proxima Nova" w:hAnsi="Proxima Nova"/>
                 <w:rtl w:val="0"/>
               </w:rPr>
-              <w:t xml:space="preserve">Evolución</w:t>
+              <w:t xml:space="preserve">Soporte</w:t>
             </w:r>
           </w:p>
         </w:tc>
@@ -16274,6 +16343,7 @@
               <w:bottom w:color="00aee4" w:space="0" w:sz="4" w:val="single"/>
               <w:right w:color="ffffff" w:space="0" w:sz="8" w:val="single"/>
             </w:tcBorders>
+            <w:shd w:fill="efefef" w:val="clear"/>
             <w:tcMar>
               <w:top w:w="100.0" w:type="dxa"/>
               <w:left w:w="100.0" w:type="dxa"/>
@@ -16306,6 +16376,7 @@
               <w:bottom w:color="00aee4" w:space="0" w:sz="4" w:val="single"/>
               <w:right w:color="ffffff" w:space="0" w:sz="8" w:val="single"/>
             </w:tcBorders>
+            <w:shd w:fill="efefef" w:val="clear"/>
             <w:tcMar>
               <w:top w:w="100.0" w:type="dxa"/>
               <w:left w:w="100.0" w:type="dxa"/>
@@ -16338,6 +16409,7 @@
               <w:bottom w:color="00aee4" w:space="0" w:sz="4" w:val="single"/>
               <w:right w:color="ffffff" w:space="0" w:sz="8" w:val="single"/>
             </w:tcBorders>
+            <w:shd w:fill="efefef" w:val="clear"/>
             <w:tcMar>
               <w:top w:w="100.0" w:type="dxa"/>
               <w:left w:w="100.0" w:type="dxa"/>
@@ -16519,7 +16591,7 @@
     <w:sdt>
       <w:sdtPr>
         <w:lock w:val="contentLocked"/>
-        <w:id w:val="909734744"/>
+        <w:id w:val="-1541270403"/>
         <w:tag w:val="goog_rdk_8"/>
       </w:sdtPr>
       <w:sdtContent>
@@ -17215,7 +17287,7 @@
     <w:sdt>
       <w:sdtPr>
         <w:lock w:val="contentLocked"/>
-        <w:id w:val="620314485"/>
+        <w:id w:val="463115729"/>
         <w:tag w:val="goog_rdk_9"/>
       </w:sdtPr>
       <w:sdtContent>
@@ -17928,7 +18000,7 @@
     <w:sdt>
       <w:sdtPr>
         <w:lock w:val="contentLocked"/>
-        <w:id w:val="-1863951797"/>
+        <w:id w:val="32185299"/>
         <w:tag w:val="goog_rdk_10"/>
       </w:sdtPr>
       <w:sdtContent>
@@ -18631,7 +18703,7 @@
     <w:sdt>
       <w:sdtPr>
         <w:lock w:val="contentLocked"/>
-        <w:id w:val="-285775634"/>
+        <w:id w:val="1898854207"/>
         <w:tag w:val="goog_rdk_11"/>
       </w:sdtPr>
       <w:sdtContent>
@@ -19326,7 +19398,7 @@
     <w:sdt>
       <w:sdtPr>
         <w:lock w:val="contentLocked"/>
-        <w:id w:val="2123091499"/>
+        <w:id w:val="29220524"/>
         <w:tag w:val="goog_rdk_12"/>
       </w:sdtPr>
       <w:sdtContent>
@@ -20023,7 +20095,7 @@
     <w:sdt>
       <w:sdtPr>
         <w:lock w:val="contentLocked"/>
-        <w:id w:val="235499328"/>
+        <w:id w:val="-128513496"/>
         <w:tag w:val="goog_rdk_13"/>
       </w:sdtPr>
       <w:sdtContent>
@@ -20730,7 +20802,7 @@
     <w:sdt>
       <w:sdtPr>
         <w:lock w:val="contentLocked"/>
-        <w:id w:val="-2143835186"/>
+        <w:id w:val="91995477"/>
         <w:tag w:val="goog_rdk_14"/>
       </w:sdtPr>
       <w:sdtContent>

</xml_diff>

<commit_message>
Plan de Gestion de la Configuracion
</commit_message>
<xml_diff>
--- a/Documentacion/Planes/SONNY-PGC.docx
+++ b/Documentacion/Planes/SONNY-PGC.docx
@@ -75,12 +75,12 @@
           <wp:inline distB="114300" distT="114300" distL="114300" distR="114300">
             <wp:extent cx="447675" cy="57150"/>
             <wp:effectExtent b="0" l="0" r="0" t="0"/>
-            <wp:docPr descr="línea corta" id="3" name="image1.png"/>
+            <wp:docPr descr="línea corta" id="2" name="image3.png"/>
             <a:graphic>
               <a:graphicData uri="http://schemas.openxmlformats.org/drawingml/2006/picture">
                 <pic:pic>
                   <pic:nvPicPr>
-                    <pic:cNvPr descr="línea corta" id="0" name="image1.png"/>
+                    <pic:cNvPr descr="línea corta" id="0" name="image3.png"/>
                     <pic:cNvPicPr preferRelativeResize="0"/>
                   </pic:nvPicPr>
                   <pic:blipFill>
@@ -452,7 +452,7 @@
     </w:p>
     <w:sdt>
       <w:sdtPr>
-        <w:id w:val="496851662"/>
+        <w:id w:val="229935046"/>
         <w:docPartObj>
           <w:docPartGallery w:val="Table of Contents"/>
           <w:docPartUnique w:val="1"/>
@@ -1105,9 +1105,11 @@
             <w:spacing w:after="0" w:before="60" w:line="240" w:lineRule="auto"/>
             <w:ind w:left="360" w:firstLine="0"/>
             <w:rPr>
-              <w:rFonts w:ascii="Proxima Nova" w:cs="Proxima Nova" w:eastAsia="Proxima Nova" w:hAnsi="Proxima Nova"/>
-              <w:i w:val="1"/>
-              <w:iCs w:val="1"/>
+              <w:rFonts w:ascii="Arial" w:cs="Arial" w:eastAsia="Arial" w:hAnsi="Arial"/>
+              <w:b w:val="0"/>
+              <w:bCs w:val="0"/>
+              <w:i w:val="0"/>
+              <w:iCs w:val="0"/>
               <w:smallCaps w:val="0"/>
               <w:strike w:val="0"/>
               <w:color w:val="000000"/>
@@ -1122,6 +1124,8 @@
             <w:r>
               <w:rPr>
                 <w:rFonts w:ascii="Proxima Nova" w:cs="Proxima Nova" w:eastAsia="Proxima Nova" w:hAnsi="Proxima Nova"/>
+                <w:b w:val="0"/>
+                <w:bCs w:val="0"/>
                 <w:i w:val="1"/>
                 <w:iCs w:val="1"/>
                 <w:smallCaps w:val="0"/>
@@ -1136,7 +1140,7 @@
               </w:rPr>
               <w:t xml:space="preserve">3.2 Control de la GCS</w:t>
               <w:tab/>
-              <w:t xml:space="preserve">11</w:t>
+              <w:t xml:space="preserve">10</w:t>
             </w:r>
           </w:hyperlink>
           <w:r>
@@ -1154,9 +1158,11 @@
             <w:spacing w:after="0" w:before="60" w:line="240" w:lineRule="auto"/>
             <w:ind w:left="720" w:firstLine="0"/>
             <w:rPr>
-              <w:rFonts w:ascii="Proxima Nova" w:cs="Proxima Nova" w:eastAsia="Proxima Nova" w:hAnsi="Proxima Nova"/>
-              <w:i w:val="1"/>
-              <w:iCs w:val="1"/>
+              <w:rFonts w:ascii="Arial" w:cs="Arial" w:eastAsia="Arial" w:hAnsi="Arial"/>
+              <w:b w:val="0"/>
+              <w:bCs w:val="0"/>
+              <w:i w:val="0"/>
+              <w:iCs w:val="0"/>
               <w:smallCaps w:val="0"/>
               <w:strike w:val="0"/>
               <w:color w:val="000000"/>
@@ -1171,6 +1177,8 @@
             <w:r>
               <w:rPr>
                 <w:rFonts w:ascii="Proxima Nova" w:cs="Proxima Nova" w:eastAsia="Proxima Nova" w:hAnsi="Proxima Nova"/>
+                <w:b w:val="0"/>
+                <w:bCs w:val="0"/>
                 <w:i w:val="1"/>
                 <w:iCs w:val="1"/>
                 <w:smallCaps w:val="0"/>
@@ -1185,7 +1193,7 @@
               </w:rPr>
               <w:t xml:space="preserve">3.2.1 Solicitud de Cambio 1</w:t>
               <w:tab/>
-              <w:t xml:space="preserve">11</w:t>
+              <w:t xml:space="preserve">10</w:t>
             </w:r>
           </w:hyperlink>
           <w:r>
@@ -1203,9 +1211,11 @@
             <w:spacing w:after="0" w:before="60" w:line="240" w:lineRule="auto"/>
             <w:ind w:left="720" w:firstLine="0"/>
             <w:rPr>
-              <w:rFonts w:ascii="Proxima Nova" w:cs="Proxima Nova" w:eastAsia="Proxima Nova" w:hAnsi="Proxima Nova"/>
-              <w:i w:val="1"/>
-              <w:iCs w:val="1"/>
+              <w:rFonts w:ascii="Arial" w:cs="Arial" w:eastAsia="Arial" w:hAnsi="Arial"/>
+              <w:b w:val="0"/>
+              <w:bCs w:val="0"/>
+              <w:i w:val="0"/>
+              <w:iCs w:val="0"/>
               <w:smallCaps w:val="0"/>
               <w:strike w:val="0"/>
               <w:color w:val="000000"/>
@@ -1220,6 +1230,8 @@
             <w:r>
               <w:rPr>
                 <w:rFonts w:ascii="Proxima Nova" w:cs="Proxima Nova" w:eastAsia="Proxima Nova" w:hAnsi="Proxima Nova"/>
+                <w:b w:val="0"/>
+                <w:bCs w:val="0"/>
                 <w:i w:val="1"/>
                 <w:iCs w:val="1"/>
                 <w:smallCaps w:val="0"/>
@@ -1252,9 +1264,11 @@
             <w:spacing w:after="0" w:before="60" w:line="240" w:lineRule="auto"/>
             <w:ind w:left="720" w:firstLine="0"/>
             <w:rPr>
-              <w:rFonts w:ascii="Proxima Nova" w:cs="Proxima Nova" w:eastAsia="Proxima Nova" w:hAnsi="Proxima Nova"/>
-              <w:i w:val="1"/>
-              <w:iCs w:val="1"/>
+              <w:rFonts w:ascii="Arial" w:cs="Arial" w:eastAsia="Arial" w:hAnsi="Arial"/>
+              <w:b w:val="0"/>
+              <w:bCs w:val="0"/>
+              <w:i w:val="0"/>
+              <w:iCs w:val="0"/>
               <w:smallCaps w:val="0"/>
               <w:strike w:val="0"/>
               <w:color w:val="000000"/>
@@ -1269,6 +1283,8 @@
             <w:r>
               <w:rPr>
                 <w:rFonts w:ascii="Proxima Nova" w:cs="Proxima Nova" w:eastAsia="Proxima Nova" w:hAnsi="Proxima Nova"/>
+                <w:b w:val="0"/>
+                <w:bCs w:val="0"/>
                 <w:i w:val="1"/>
                 <w:iCs w:val="1"/>
                 <w:smallCaps w:val="0"/>
@@ -1282,6 +1298,112 @@
                 <w:rtl w:val="0"/>
               </w:rPr>
               <w:t xml:space="preserve">3.2.3 Solicitud de Cambio 3</w:t>
+              <w:tab/>
+              <w:t xml:space="preserve">11</w:t>
+            </w:r>
+          </w:hyperlink>
+          <w:r>
+            <w:rPr>
+              <w:rtl w:val="0"/>
+            </w:rPr>
+          </w:r>
+        </w:p>
+        <w:p>
+          <w:pPr>
+            <w:widowControl w:val="0"/>
+            <w:tabs>
+              <w:tab w:val="right" w:leader="none" w:pos="12000"/>
+            </w:tabs>
+            <w:spacing w:after="0" w:before="60" w:line="240" w:lineRule="auto"/>
+            <w:ind w:left="720" w:firstLine="0"/>
+            <w:rPr>
+              <w:rFonts w:ascii="Arial" w:cs="Arial" w:eastAsia="Arial" w:hAnsi="Arial"/>
+              <w:b w:val="0"/>
+              <w:bCs w:val="0"/>
+              <w:i w:val="0"/>
+              <w:iCs w:val="0"/>
+              <w:smallCaps w:val="0"/>
+              <w:strike w:val="0"/>
+              <w:color w:val="000000"/>
+              <w:sz w:val="22"/>
+              <w:szCs w:val="22"/>
+              <w:u w:val="none"/>
+              <w:shd w:fill="auto" w:val="clear"/>
+              <w:vertAlign w:val="baseline"/>
+            </w:rPr>
+          </w:pPr>
+          <w:hyperlink w:anchor="_heading=h.xcrj75ku4jpb">
+            <w:r>
+              <w:rPr>
+                <w:rFonts w:ascii="Proxima Nova" w:cs="Proxima Nova" w:eastAsia="Proxima Nova" w:hAnsi="Proxima Nova"/>
+                <w:b w:val="0"/>
+                <w:bCs w:val="0"/>
+                <w:i w:val="1"/>
+                <w:iCs w:val="1"/>
+                <w:smallCaps w:val="0"/>
+                <w:strike w:val="0"/>
+                <w:color w:val="000000"/>
+                <w:sz w:val="22"/>
+                <w:szCs w:val="22"/>
+                <w:u w:val="none"/>
+                <w:shd w:fill="auto" w:val="clear"/>
+                <w:vertAlign w:val="baseline"/>
+                <w:rtl w:val="0"/>
+              </w:rPr>
+              <w:t xml:space="preserve">3.2.4 Solicitud de Cambio 4</w:t>
+              <w:tab/>
+              <w:t xml:space="preserve">11</w:t>
+            </w:r>
+          </w:hyperlink>
+          <w:r>
+            <w:rPr>
+              <w:rtl w:val="0"/>
+            </w:rPr>
+          </w:r>
+        </w:p>
+        <w:p>
+          <w:pPr>
+            <w:widowControl w:val="0"/>
+            <w:tabs>
+              <w:tab w:val="right" w:leader="none" w:pos="12000"/>
+            </w:tabs>
+            <w:spacing w:after="0" w:before="60" w:line="240" w:lineRule="auto"/>
+            <w:ind w:left="720" w:firstLine="0"/>
+            <w:rPr>
+              <w:rFonts w:ascii="Arial" w:cs="Arial" w:eastAsia="Arial" w:hAnsi="Arial"/>
+              <w:b w:val="0"/>
+              <w:bCs w:val="0"/>
+              <w:i w:val="0"/>
+              <w:iCs w:val="0"/>
+              <w:smallCaps w:val="0"/>
+              <w:strike w:val="0"/>
+              <w:color w:val="000000"/>
+              <w:sz w:val="22"/>
+              <w:szCs w:val="22"/>
+              <w:u w:val="none"/>
+              <w:shd w:fill="auto" w:val="clear"/>
+              <w:vertAlign w:val="baseline"/>
+            </w:rPr>
+          </w:pPr>
+          <w:hyperlink w:anchor="_heading=h.9r440b4291p6">
+            <w:r>
+              <w:rPr>
+                <w:rFonts w:ascii="Proxima Nova" w:cs="Proxima Nova" w:eastAsia="Proxima Nova" w:hAnsi="Proxima Nova"/>
+                <w:b w:val="0"/>
+                <w:bCs w:val="0"/>
+                <w:i w:val="1"/>
+                <w:iCs w:val="1"/>
+                <w:smallCaps w:val="0"/>
+                <w:strike w:val="0"/>
+                <w:color w:val="000000"/>
+                <w:sz w:val="22"/>
+                <w:szCs w:val="22"/>
+                <w:u w:val="none"/>
+                <w:shd w:fill="auto" w:val="clear"/>
+                <w:vertAlign w:val="baseline"/>
+                <w:rtl w:val="0"/>
+              </w:rPr>
+              <w:t xml:space="preserve">3.2.5 Solicitud de Cambio 5</w:t>
               <w:tab/>
               <w:t xml:space="preserve">12</w:t>
             </w:r>
@@ -1301,9 +1423,11 @@
             <w:spacing w:after="0" w:before="60" w:line="240" w:lineRule="auto"/>
             <w:ind w:left="720" w:firstLine="0"/>
             <w:rPr>
-              <w:rFonts w:ascii="Proxima Nova" w:cs="Proxima Nova" w:eastAsia="Proxima Nova" w:hAnsi="Proxima Nova"/>
-              <w:i w:val="1"/>
-              <w:iCs w:val="1"/>
+              <w:rFonts w:ascii="Arial" w:cs="Arial" w:eastAsia="Arial" w:hAnsi="Arial"/>
+              <w:b w:val="0"/>
+              <w:bCs w:val="0"/>
+              <w:i w:val="0"/>
+              <w:iCs w:val="0"/>
               <w:smallCaps w:val="0"/>
               <w:strike w:val="0"/>
               <w:color w:val="000000"/>
@@ -1314,10 +1438,12 @@
               <w:vertAlign w:val="baseline"/>
             </w:rPr>
           </w:pPr>
-          <w:hyperlink w:anchor="_heading=h.xcrj75ku4jpb">
+          <w:hyperlink w:anchor="_heading=h.eifoq5cv39m2">
             <w:r>
               <w:rPr>
                 <w:rFonts w:ascii="Proxima Nova" w:cs="Proxima Nova" w:eastAsia="Proxima Nova" w:hAnsi="Proxima Nova"/>
+                <w:b w:val="0"/>
+                <w:bCs w:val="0"/>
                 <w:i w:val="1"/>
                 <w:iCs w:val="1"/>
                 <w:smallCaps w:val="0"/>
@@ -1330,7 +1456,7 @@
                 <w:vertAlign w:val="baseline"/>
                 <w:rtl w:val="0"/>
               </w:rPr>
-              <w:t xml:space="preserve">3.2.4 Solicitud de Cambio 4</w:t>
+              <w:t xml:space="preserve">3.2.6 Solicitud de Cambio 6</w:t>
               <w:tab/>
               <w:t xml:space="preserve">12</w:t>
             </w:r>
@@ -1350,107 +1476,11 @@
             <w:spacing w:after="0" w:before="60" w:line="240" w:lineRule="auto"/>
             <w:ind w:left="720" w:firstLine="0"/>
             <w:rPr>
-              <w:rFonts w:ascii="Proxima Nova" w:cs="Proxima Nova" w:eastAsia="Proxima Nova" w:hAnsi="Proxima Nova"/>
-              <w:i w:val="1"/>
-              <w:iCs w:val="1"/>
-              <w:smallCaps w:val="0"/>
-              <w:strike w:val="0"/>
-              <w:color w:val="000000"/>
-              <w:sz w:val="22"/>
-              <w:szCs w:val="22"/>
-              <w:u w:val="none"/>
-              <w:shd w:fill="auto" w:val="clear"/>
-              <w:vertAlign w:val="baseline"/>
-            </w:rPr>
-          </w:pPr>
-          <w:hyperlink w:anchor="_heading=h.9r440b4291p6">
-            <w:r>
-              <w:rPr>
-                <w:rFonts w:ascii="Proxima Nova" w:cs="Proxima Nova" w:eastAsia="Proxima Nova" w:hAnsi="Proxima Nova"/>
-                <w:i w:val="1"/>
-                <w:iCs w:val="1"/>
-                <w:smallCaps w:val="0"/>
-                <w:strike w:val="0"/>
-                <w:color w:val="000000"/>
-                <w:sz w:val="22"/>
-                <w:szCs w:val="22"/>
-                <w:u w:val="none"/>
-                <w:shd w:fill="auto" w:val="clear"/>
-                <w:vertAlign w:val="baseline"/>
-                <w:rtl w:val="0"/>
-              </w:rPr>
-              <w:t xml:space="preserve">3.2.5 Solicitud de Cambio 5</w:t>
-              <w:tab/>
-              <w:t xml:space="preserve">13</w:t>
-            </w:r>
-          </w:hyperlink>
-          <w:r>
-            <w:rPr>
-              <w:rtl w:val="0"/>
-            </w:rPr>
-          </w:r>
-        </w:p>
-        <w:p>
-          <w:pPr>
-            <w:widowControl w:val="0"/>
-            <w:tabs>
-              <w:tab w:val="right" w:leader="none" w:pos="12000"/>
-            </w:tabs>
-            <w:spacing w:after="0" w:before="60" w:line="240" w:lineRule="auto"/>
-            <w:ind w:left="720" w:firstLine="0"/>
-            <w:rPr>
-              <w:rFonts w:ascii="Proxima Nova" w:cs="Proxima Nova" w:eastAsia="Proxima Nova" w:hAnsi="Proxima Nova"/>
-              <w:i w:val="1"/>
-              <w:iCs w:val="1"/>
-              <w:smallCaps w:val="0"/>
-              <w:strike w:val="0"/>
-              <w:color w:val="000000"/>
-              <w:sz w:val="22"/>
-              <w:szCs w:val="22"/>
-              <w:u w:val="none"/>
-              <w:shd w:fill="auto" w:val="clear"/>
-              <w:vertAlign w:val="baseline"/>
-            </w:rPr>
-          </w:pPr>
-          <w:hyperlink w:anchor="_heading=h.eifoq5cv39m2">
-            <w:r>
-              <w:rPr>
-                <w:rFonts w:ascii="Proxima Nova" w:cs="Proxima Nova" w:eastAsia="Proxima Nova" w:hAnsi="Proxima Nova"/>
-                <w:i w:val="1"/>
-                <w:iCs w:val="1"/>
-                <w:smallCaps w:val="0"/>
-                <w:strike w:val="0"/>
-                <w:color w:val="000000"/>
-                <w:sz w:val="22"/>
-                <w:szCs w:val="22"/>
-                <w:u w:val="none"/>
-                <w:shd w:fill="auto" w:val="clear"/>
-                <w:vertAlign w:val="baseline"/>
-                <w:rtl w:val="0"/>
-              </w:rPr>
-              <w:t xml:space="preserve">3.2.6 Solicitud de Cambio 6</w:t>
-              <w:tab/>
-              <w:t xml:space="preserve">13</w:t>
-            </w:r>
-          </w:hyperlink>
-          <w:r>
-            <w:rPr>
-              <w:rtl w:val="0"/>
-            </w:rPr>
-          </w:r>
-        </w:p>
-        <w:p>
-          <w:pPr>
-            <w:widowControl w:val="0"/>
-            <w:tabs>
-              <w:tab w:val="right" w:leader="none" w:pos="12000"/>
-            </w:tabs>
-            <w:spacing w:after="0" w:before="60" w:line="240" w:lineRule="auto"/>
-            <w:ind w:left="720" w:firstLine="0"/>
-            <w:rPr>
-              <w:rFonts w:ascii="Proxima Nova" w:cs="Proxima Nova" w:eastAsia="Proxima Nova" w:hAnsi="Proxima Nova"/>
-              <w:i w:val="1"/>
-              <w:iCs w:val="1"/>
+              <w:rFonts w:ascii="Arial" w:cs="Arial" w:eastAsia="Arial" w:hAnsi="Arial"/>
+              <w:b w:val="0"/>
+              <w:bCs w:val="0"/>
+              <w:i w:val="0"/>
+              <w:iCs w:val="0"/>
               <w:smallCaps w:val="0"/>
               <w:strike w:val="0"/>
               <w:color w:val="000000"/>
@@ -1465,6 +1495,8 @@
             <w:r>
               <w:rPr>
                 <w:rFonts w:ascii="Proxima Nova" w:cs="Proxima Nova" w:eastAsia="Proxima Nova" w:hAnsi="Proxima Nova"/>
+                <w:b w:val="0"/>
+                <w:bCs w:val="0"/>
                 <w:i w:val="1"/>
                 <w:iCs w:val="1"/>
                 <w:smallCaps w:val="0"/>
@@ -1479,7 +1511,7 @@
               </w:rPr>
               <w:t xml:space="preserve">3.2.7 Solicitud de Cambio 7</w:t>
               <w:tab/>
-              <w:t xml:space="preserve">14</w:t>
+              <w:t xml:space="preserve">13</w:t>
             </w:r>
           </w:hyperlink>
           <w:r>
@@ -3078,7 +3110,7 @@
     <w:sdt>
       <w:sdtPr>
         <w:lock w:val="contentLocked"/>
-        <w:id w:val="1997096594"/>
+        <w:id w:val="-1792116298"/>
         <w:tag w:val="goog_rdk_0"/>
       </w:sdtPr>
       <w:sdtContent>
@@ -3842,7 +3874,7 @@
     <w:sdt>
       <w:sdtPr>
         <w:lock w:val="contentLocked"/>
-        <w:id w:val="-1867795388"/>
+        <w:id w:val="1832817448"/>
         <w:tag w:val="goog_rdk_1"/>
       </w:sdtPr>
       <w:sdtContent>
@@ -4879,7 +4911,7 @@
     <w:sdt>
       <w:sdtPr>
         <w:lock w:val="contentLocked"/>
-        <w:id w:val="586088857"/>
+        <w:id w:val="1415675858"/>
         <w:tag w:val="goog_rdk_2"/>
       </w:sdtPr>
       <w:sdtContent>
@@ -7500,7 +7532,7 @@
     <w:sdt>
       <w:sdtPr>
         <w:lock w:val="contentLocked"/>
-        <w:id w:val="-1661328867"/>
+        <w:id w:val="2075662252"/>
         <w:tag w:val="goog_rdk_3"/>
       </w:sdtPr>
       <w:sdtContent>
@@ -10163,7 +10195,7 @@
                   <w:bottom w:color="000000" w:space="0" w:sz="4" w:val="single"/>
                   <w:right w:color="000000" w:space="0" w:sz="4" w:val="single"/>
                 </w:tcBorders>
-                <w:shd w:fill="auto" w:val="clear"/>
+                <w:shd w:fill="efefef" w:val="clear"/>
                 <w:tcMar>
                   <w:top w:w="100.0" w:type="dxa"/>
                   <w:left w:w="100.0" w:type="dxa"/>
@@ -10210,7 +10242,7 @@
                   <w:bottom w:color="000000" w:space="0" w:sz="4" w:val="single"/>
                   <w:right w:color="000000" w:space="0" w:sz="4" w:val="single"/>
                 </w:tcBorders>
-                <w:shd w:fill="f9f9f9" w:val="clear"/>
+                <w:shd w:fill="efefef" w:val="clear"/>
                 <w:tcMar>
                   <w:top w:w="100.0" w:type="dxa"/>
                   <w:left w:w="100.0" w:type="dxa"/>
@@ -10243,6 +10275,7 @@
                   <w:bottom w:color="000000" w:space="0" w:sz="4" w:val="single"/>
                   <w:right w:color="000000" w:space="0" w:sz="4" w:val="single"/>
                 </w:tcBorders>
+                <w:shd w:fill="efefef" w:val="clear"/>
                 <w:tcMar>
                   <w:top w:w="100.0" w:type="dxa"/>
                   <w:left w:w="100.0" w:type="dxa"/>
@@ -10277,7 +10310,7 @@
                   <w:bottom w:color="000000" w:space="0" w:sz="4" w:val="single"/>
                   <w:right w:color="000000" w:space="0" w:sz="4" w:val="single"/>
                 </w:tcBorders>
-                <w:shd w:fill="f9f9f9" w:val="clear"/>
+                <w:shd w:fill="efefef" w:val="clear"/>
                 <w:tcMar>
                   <w:top w:w="100.0" w:type="dxa"/>
                   <w:left w:w="100.0" w:type="dxa"/>
@@ -10310,6 +10343,7 @@
                   <w:bottom w:color="000000" w:space="0" w:sz="4" w:val="single"/>
                   <w:right w:color="000000" w:space="0" w:sz="4" w:val="single"/>
                 </w:tcBorders>
+                <w:shd w:fill="efefef" w:val="clear"/>
                 <w:tcMar>
                   <w:top w:w="100.0" w:type="dxa"/>
                   <w:left w:w="100.0" w:type="dxa"/>
@@ -10344,7 +10378,7 @@
                   <w:bottom w:color="000000" w:space="0" w:sz="4" w:val="single"/>
                   <w:right w:color="000000" w:space="0" w:sz="4" w:val="single"/>
                 </w:tcBorders>
-                <w:shd w:fill="f9f9f9" w:val="clear"/>
+                <w:shd w:fill="efefef" w:val="clear"/>
                 <w:tcMar>
                   <w:top w:w="100.0" w:type="dxa"/>
                   <w:left w:w="100.0" w:type="dxa"/>
@@ -10377,6 +10411,7 @@
                   <w:bottom w:color="000000" w:space="0" w:sz="4" w:val="single"/>
                   <w:right w:color="000000" w:space="0" w:sz="4" w:val="single"/>
                 </w:tcBorders>
+                <w:shd w:fill="efefef" w:val="clear"/>
                 <w:tcMar>
                   <w:top w:w="100.0" w:type="dxa"/>
                   <w:left w:w="100.0" w:type="dxa"/>
@@ -10411,7 +10446,7 @@
                   <w:bottom w:color="000000" w:space="0" w:sz="4" w:val="single"/>
                   <w:right w:color="000000" w:space="0" w:sz="4" w:val="single"/>
                 </w:tcBorders>
-                <w:shd w:fill="f9f9f9" w:val="clear"/>
+                <w:shd w:fill="efefef" w:val="clear"/>
                 <w:tcMar>
                   <w:top w:w="100.0" w:type="dxa"/>
                   <w:left w:w="100.0" w:type="dxa"/>
@@ -10444,6 +10479,7 @@
                   <w:bottom w:color="000000" w:space="0" w:sz="4" w:val="single"/>
                   <w:right w:color="000000" w:space="0" w:sz="4" w:val="single"/>
                 </w:tcBorders>
+                <w:shd w:fill="efefef" w:val="clear"/>
                 <w:tcMar>
                   <w:top w:w="100.0" w:type="dxa"/>
                   <w:left w:w="100.0" w:type="dxa"/>
@@ -10544,10 +10580,32 @@
         <w:spacing w:after="0" w:before="480" w:line="300" w:lineRule="auto"/>
         <w:rPr>
           <w:rFonts w:ascii="Proxima Nova" w:cs="Proxima Nova" w:eastAsia="Proxima Nova" w:hAnsi="Proxima Nova"/>
+          <w:color w:val="039be5"/>
+          <w:sz w:val="36"/>
+          <w:szCs w:val="36"/>
         </w:rPr>
       </w:pPr>
-      <w:bookmarkStart w:colFirst="0" w:colLast="0" w:name="_heading=h.cxfns0cohih9" w:id="8"/>
+      <w:bookmarkStart w:colFirst="0" w:colLast="0" w:name="_heading=h.ujkyugjazyci" w:id="8"/>
       <w:bookmarkEnd w:id="8"/>
+      <w:r>
+        <w:br w:type="page"/>
+      </w:r>
+      <w:r>
+        <w:rPr>
+          <w:rtl w:val="0"/>
+        </w:rPr>
+      </w:r>
+    </w:p>
+    <w:p>
+      <w:pPr>
+        <w:pStyle w:val="Heading1"/>
+        <w:spacing w:after="0" w:before="480" w:line="300" w:lineRule="auto"/>
+        <w:rPr>
+          <w:rFonts w:ascii="Proxima Nova" w:cs="Proxima Nova" w:eastAsia="Proxima Nova" w:hAnsi="Proxima Nova"/>
+        </w:rPr>
+      </w:pPr>
+      <w:bookmarkStart w:colFirst="0" w:colLast="0" w:name="_heading=h.cxfns0cohih9" w:id="9"/>
+      <w:bookmarkEnd w:id="9"/>
       <w:r>
         <w:rPr>
           <w:rFonts w:ascii="Proxima Nova" w:cs="Proxima Nova" w:eastAsia="Proxima Nova" w:hAnsi="Proxima Nova"/>
@@ -10574,8 +10632,8 @@
           <w:bCs w:val="1"/>
         </w:rPr>
       </w:pPr>
-      <w:bookmarkStart w:colFirst="0" w:colLast="0" w:name="_heading=h.ogfdulzed76k" w:id="9"/>
-      <w:bookmarkEnd w:id="9"/>
+      <w:bookmarkStart w:colFirst="0" w:colLast="0" w:name="_heading=h.ogfdulzed76k" w:id="10"/>
+      <w:bookmarkEnd w:id="10"/>
       <w:r>
         <w:rPr>
           <w:rFonts w:ascii="Proxima Nova" w:cs="Proxima Nova" w:eastAsia="Proxima Nova" w:hAnsi="Proxima Nova"/>
@@ -10602,8 +10660,8 @@
           <w:bCs w:val="1"/>
         </w:rPr>
       </w:pPr>
-      <w:bookmarkStart w:colFirst="0" w:colLast="0" w:name="_heading=h.lh6huhqns082" w:id="10"/>
-      <w:bookmarkEnd w:id="10"/>
+      <w:bookmarkStart w:colFirst="0" w:colLast="0" w:name="_heading=h.lh6huhqns082" w:id="11"/>
+      <w:bookmarkEnd w:id="11"/>
       <w:r>
         <w:rPr>
           <w:rFonts w:ascii="Proxima Nova" w:cs="Proxima Nova" w:eastAsia="Proxima Nova" w:hAnsi="Proxima Nova"/>
@@ -10636,28 +10694,28 @@
       </w:r>
       <w:r>
         <w:drawing>
-          <wp:anchor allowOverlap="1" behindDoc="0" distB="114300" distT="114300" distL="114300" distR="114300" hidden="0" layoutInCell="1" locked="0" relativeHeight="0" simplePos="0">
+          <wp:anchor allowOverlap="1" behindDoc="0" distB="0" distT="0" distL="0" distR="0" hidden="0" layoutInCell="1" locked="0" relativeHeight="0" simplePos="0">
             <wp:simplePos x="0" y="0"/>
             <wp:positionH relativeFrom="column">
-              <wp:posOffset>-314324</wp:posOffset>
+              <wp:posOffset>-472</wp:posOffset>
             </wp:positionH>
             <wp:positionV relativeFrom="paragraph">
-              <wp:posOffset>152400</wp:posOffset>
+              <wp:posOffset>50275</wp:posOffset>
             </wp:positionV>
-            <wp:extent cx="6365038" cy="4691083"/>
+            <wp:extent cx="5399730" cy="4038600"/>
             <wp:effectExtent b="0" l="0" r="0" t="0"/>
-            <wp:wrapSquare wrapText="bothSides" distB="114300" distT="114300" distL="114300" distR="114300"/>
-            <wp:docPr id="1" name="image3.png"/>
+            <wp:wrapTopAndBottom distB="0" distT="0"/>
+            <wp:docPr id="4" name="image2.png"/>
             <a:graphic>
               <a:graphicData uri="http://schemas.openxmlformats.org/drawingml/2006/picture">
                 <pic:pic>
                   <pic:nvPicPr>
-                    <pic:cNvPr id="0" name="image3.png"/>
+                    <pic:cNvPr id="0" name="image2.png"/>
                     <pic:cNvPicPr preferRelativeResize="0"/>
                   </pic:nvPicPr>
                   <pic:blipFill>
                     <a:blip r:embed="rId12"/>
-                    <a:srcRect b="5643" l="0" r="0" t="0"/>
+                    <a:srcRect b="0" l="0" r="0" t="0"/>
                     <a:stretch>
                       <a:fillRect/>
                     </a:stretch>
@@ -10665,7 +10723,7 @@
                   <pic:spPr>
                     <a:xfrm>
                       <a:off x="0" y="0"/>
-                      <a:ext cx="6365038" cy="4691083"/>
+                      <a:ext cx="5399730" cy="4038600"/>
                     </a:xfrm>
                     <a:prstGeom prst="rect"/>
                     <a:ln/>
@@ -10685,8 +10743,8 @@
           <w:rFonts w:ascii="Proxima Nova" w:cs="Proxima Nova" w:eastAsia="Proxima Nova" w:hAnsi="Proxima Nova"/>
         </w:rPr>
       </w:pPr>
-      <w:bookmarkStart w:colFirst="0" w:colLast="0" w:name="_heading=h.v3pesbi2zf64" w:id="11"/>
-      <w:bookmarkEnd w:id="11"/>
+      <w:bookmarkStart w:colFirst="0" w:colLast="0" w:name="_heading=h.v3pesbi2zf64" w:id="12"/>
+      <w:bookmarkEnd w:id="12"/>
       <w:r>
         <w:rPr>
           <w:rFonts w:ascii="Proxima Nova" w:cs="Proxima Nova" w:eastAsia="Proxima Nova" w:hAnsi="Proxima Nova"/>
@@ -10747,7 +10805,7 @@
     <w:sdt>
       <w:sdtPr>
         <w:lock w:val="contentLocked"/>
-        <w:id w:val="250202351"/>
+        <w:id w:val="1826115490"/>
         <w:tag w:val="goog_rdk_4"/>
       </w:sdtPr>
       <w:sdtContent>
@@ -10885,7 +10943,7 @@
     <w:sdt>
       <w:sdtPr>
         <w:lock w:val="contentLocked"/>
-        <w:id w:val="1471000023"/>
+        <w:id w:val="1741982508"/>
         <w:tag w:val="goog_rdk_5"/>
       </w:sdtPr>
       <w:sdtContent>
@@ -10990,21 +11048,6 @@
       </w:pPr>
       <w:r>
         <w:rPr>
-          <w:rtl w:val="0"/>
-        </w:rPr>
-      </w:r>
-    </w:p>
-    <w:p>
-      <w:pPr>
-        <w:spacing w:after="0" w:lineRule="auto"/>
-        <w:ind w:left="0" w:firstLine="0"/>
-        <w:jc w:val="both"/>
-        <w:rPr>
-          <w:rFonts w:ascii="Proxima Nova" w:cs="Proxima Nova" w:eastAsia="Proxima Nova" w:hAnsi="Proxima Nova"/>
-        </w:rPr>
-      </w:pPr>
-      <w:r>
-        <w:rPr>
           <w:rFonts w:ascii="Proxima Nova" w:cs="Proxima Nova" w:eastAsia="Proxima Nova" w:hAnsi="Proxima Nova"/>
           <w:b w:val="1"/>
           <w:bCs w:val="1"/>
@@ -11038,7 +11081,7 @@
     <w:sdt>
       <w:sdtPr>
         <w:lock w:val="contentLocked"/>
-        <w:id w:val="-987064893"/>
+        <w:id w:val="143534755"/>
         <w:tag w:val="goog_rdk_6"/>
       </w:sdtPr>
       <w:sdtContent>
@@ -11139,6 +11182,23 @@
         <w:jc w:val="both"/>
         <w:rPr>
           <w:rFonts w:ascii="Proxima Nova" w:cs="Proxima Nova" w:eastAsia="Proxima Nova" w:hAnsi="Proxima Nova"/>
+          <w:b w:val="1"/>
+          <w:bCs w:val="1"/>
+        </w:rPr>
+      </w:pPr>
+      <w:r>
+        <w:rPr>
+          <w:rtl w:val="0"/>
+        </w:rPr>
+      </w:r>
+    </w:p>
+    <w:p>
+      <w:pPr>
+        <w:spacing w:after="0" w:lineRule="auto"/>
+        <w:ind w:left="0" w:firstLine="0"/>
+        <w:jc w:val="both"/>
+        <w:rPr>
+          <w:rFonts w:ascii="Proxima Nova" w:cs="Proxima Nova" w:eastAsia="Proxima Nova" w:hAnsi="Proxima Nova"/>
         </w:rPr>
       </w:pPr>
       <w:r>
@@ -11176,7 +11236,7 @@
     <w:sdt>
       <w:sdtPr>
         <w:lock w:val="contentLocked"/>
-        <w:id w:val="-1207348140"/>
+        <w:id w:val="47771137"/>
         <w:tag w:val="goog_rdk_7"/>
       </w:sdtPr>
       <w:sdtContent>
@@ -11291,8 +11351,8 @@
         <w:spacing w:after="200" w:before="200" w:line="300" w:lineRule="auto"/>
         <w:rPr/>
       </w:pPr>
-      <w:bookmarkStart w:colFirst="0" w:colLast="0" w:name="_heading=h.qa9igwvqetd2" w:id="12"/>
-      <w:bookmarkEnd w:id="12"/>
+      <w:bookmarkStart w:colFirst="0" w:colLast="0" w:name="_heading=h.qa9igwvqetd2" w:id="13"/>
+      <w:bookmarkEnd w:id="13"/>
       <w:r>
         <w:rPr>
           <w:rFonts w:ascii="Proxima Nova" w:cs="Proxima Nova" w:eastAsia="Proxima Nova" w:hAnsi="Proxima Nova"/>
@@ -14035,7 +14095,7 @@
                 <w:rFonts w:ascii="Proxima Nova" w:cs="Proxima Nova" w:eastAsia="Proxima Nova" w:hAnsi="Proxima Nova"/>
                 <w:rtl w:val="0"/>
               </w:rPr>
-              <w:t xml:space="preserve">Modelos del sistema</w:t>
+              <w:t xml:space="preserve">API REST funcional</w:t>
             </w:r>
           </w:p>
         </w:tc>
@@ -14067,7 +14127,7 @@
                 <w:rFonts w:ascii="Proxima Nova" w:cs="Proxima Nova" w:eastAsia="Proxima Nova" w:hAnsi="Proxima Nova"/>
                 <w:rtl w:val="0"/>
               </w:rPr>
-              <w:t xml:space="preserve">SISCOP-MOD.py</w:t>
+              <w:t xml:space="preserve">SISCOP-API.py</w:t>
             </w:r>
           </w:p>
         </w:tc>
@@ -14172,7 +14232,7 @@
                 <w:rFonts w:ascii="Proxima Nova" w:cs="Proxima Nova" w:eastAsia="Proxima Nova" w:hAnsi="Proxima Nova"/>
                 <w:rtl w:val="0"/>
               </w:rPr>
-              <w:t xml:space="preserve">Servicios del sistema</w:t>
+              <w:t xml:space="preserve">Módulo de autenticación</w:t>
             </w:r>
           </w:p>
         </w:tc>
@@ -14205,7 +14265,7 @@
                 <w:rFonts w:ascii="Proxima Nova" w:cs="Proxima Nova" w:eastAsia="Proxima Nova" w:hAnsi="Proxima Nova"/>
                 <w:rtl w:val="0"/>
               </w:rPr>
-              <w:t xml:space="preserve">SISCOP-SRV.py</w:t>
+              <w:t xml:space="preserve">SISCOP-AUTH.py</w:t>
             </w:r>
           </w:p>
         </w:tc>
@@ -14246,7 +14306,7 @@
       <w:tr>
         <w:trPr>
           <w:cantSplit w:val="0"/>
-          <w:trHeight w:val="500" w:hRule="atLeast"/>
+          <w:trHeight w:val="770" w:hRule="atLeast"/>
           <w:tblHeader w:val="0"/>
         </w:trPr>
         <w:tc>
@@ -14309,7 +14369,7 @@
                 <w:rFonts w:ascii="Proxima Nova" w:cs="Proxima Nova" w:eastAsia="Proxima Nova" w:hAnsi="Proxima Nova"/>
                 <w:rtl w:val="0"/>
               </w:rPr>
-              <w:t xml:space="preserve">API REST funcional</w:t>
+              <w:t xml:space="preserve">Sistema de rutas</w:t>
             </w:r>
           </w:p>
         </w:tc>
@@ -14341,7 +14401,7 @@
                 <w:rFonts w:ascii="Proxima Nova" w:cs="Proxima Nova" w:eastAsia="Proxima Nova" w:hAnsi="Proxima Nova"/>
                 <w:rtl w:val="0"/>
               </w:rPr>
-              <w:t xml:space="preserve">SISCOP-API.py</w:t>
+              <w:t xml:space="preserve">SISCOP-ROUTES.jsx</w:t>
             </w:r>
           </w:p>
         </w:tc>
@@ -14446,7 +14506,7 @@
                 <w:rFonts w:ascii="Proxima Nova" w:cs="Proxima Nova" w:eastAsia="Proxima Nova" w:hAnsi="Proxima Nova"/>
                 <w:rtl w:val="0"/>
               </w:rPr>
-              <w:t xml:space="preserve">Módulo de autenticación</w:t>
+              <w:t xml:space="preserve">Pantalla de autenticación</w:t>
             </w:r>
           </w:p>
         </w:tc>
@@ -14479,7 +14539,7 @@
                 <w:rFonts w:ascii="Proxima Nova" w:cs="Proxima Nova" w:eastAsia="Proxima Nova" w:hAnsi="Proxima Nova"/>
                 <w:rtl w:val="0"/>
               </w:rPr>
-              <w:t xml:space="preserve">SISCOP-AUTH.py</w:t>
+              <w:t xml:space="preserve">SISCOP-LOGIN.jsx</w:t>
             </w:r>
           </w:p>
         </w:tc>
@@ -14583,7 +14643,7 @@
                 <w:rFonts w:ascii="Proxima Nova" w:cs="Proxima Nova" w:eastAsia="Proxima Nova" w:hAnsi="Proxima Nova"/>
                 <w:rtl w:val="0"/>
               </w:rPr>
-              <w:t xml:space="preserve">Validaciones backend</w:t>
+              <w:t xml:space="preserve">Interfaces funcionales de pacientes</w:t>
             </w:r>
           </w:p>
         </w:tc>
@@ -14615,7 +14675,7 @@
                 <w:rFonts w:ascii="Proxima Nova" w:cs="Proxima Nova" w:eastAsia="Proxima Nova" w:hAnsi="Proxima Nova"/>
                 <w:rtl w:val="0"/>
               </w:rPr>
-              <w:t xml:space="preserve">SISCOP-VBACK.py</w:t>
+              <w:t xml:space="preserve">SISCOP-PAC.jsx</w:t>
             </w:r>
           </w:p>
         </w:tc>
@@ -14720,7 +14780,7 @@
                 <w:rFonts w:ascii="Proxima Nova" w:cs="Proxima Nova" w:eastAsia="Proxima Nova" w:hAnsi="Proxima Nova"/>
                 <w:rtl w:val="0"/>
               </w:rPr>
-              <w:t xml:space="preserve">Módulo de reportes PDF</w:t>
+              <w:t xml:space="preserve">Interfaces funcionales de historia clínica</w:t>
             </w:r>
           </w:p>
         </w:tc>
@@ -14753,7 +14813,7 @@
                 <w:rFonts w:ascii="Proxima Nova" w:cs="Proxima Nova" w:eastAsia="Proxima Nova" w:hAnsi="Proxima Nova"/>
                 <w:rtl w:val="0"/>
               </w:rPr>
-              <w:t xml:space="preserve">SISCOP-RPDF.py</w:t>
+              <w:t xml:space="preserve">SISCOP-HC.jsx</w:t>
             </w:r>
           </w:p>
         </w:tc>
@@ -14794,7 +14854,7 @@
       <w:tr>
         <w:trPr>
           <w:cantSplit w:val="0"/>
-          <w:trHeight w:val="770" w:hRule="atLeast"/>
+          <w:trHeight w:val="500" w:hRule="atLeast"/>
           <w:tblHeader w:val="0"/>
         </w:trPr>
         <w:tc>
@@ -14857,7 +14917,7 @@
                 <w:rFonts w:ascii="Proxima Nova" w:cs="Proxima Nova" w:eastAsia="Proxima Nova" w:hAnsi="Proxima Nova"/>
                 <w:rtl w:val="0"/>
               </w:rPr>
-              <w:t xml:space="preserve">Sistema de rutas</w:t>
+              <w:t xml:space="preserve">Interfaces funcionales de evaluación nutricional</w:t>
             </w:r>
           </w:p>
         </w:tc>
@@ -14889,7 +14949,7 @@
                 <w:rFonts w:ascii="Proxima Nova" w:cs="Proxima Nova" w:eastAsia="Proxima Nova" w:hAnsi="Proxima Nova"/>
                 <w:rtl w:val="0"/>
               </w:rPr>
-              <w:t xml:space="preserve">SISCOP-ROUTES.jsx</w:t>
+              <w:t xml:space="preserve">SISCOP-EVN.jsx</w:t>
             </w:r>
           </w:p>
         </w:tc>
@@ -14994,7 +15054,7 @@
                 <w:rFonts w:ascii="Proxima Nova" w:cs="Proxima Nova" w:eastAsia="Proxima Nova" w:hAnsi="Proxima Nova"/>
                 <w:rtl w:val="0"/>
               </w:rPr>
-              <w:t xml:space="preserve">Pantalla de autenticación</w:t>
+              <w:t xml:space="preserve">Módulo gráfico</w:t>
             </w:r>
           </w:p>
         </w:tc>
@@ -15027,7 +15087,7 @@
                 <w:rFonts w:ascii="Proxima Nova" w:cs="Proxima Nova" w:eastAsia="Proxima Nova" w:hAnsi="Proxima Nova"/>
                 <w:rtl w:val="0"/>
               </w:rPr>
-              <w:t xml:space="preserve">SISCOP-LOGIN.jsx</w:t>
+              <w:t xml:space="preserve">SISCOP-GRAF.jsx</w:t>
             </w:r>
           </w:p>
         </w:tc>
@@ -15099,7 +15159,7 @@
                 <w:rFonts w:ascii="Proxima Nova" w:cs="Proxima Nova" w:eastAsia="Proxima Nova" w:hAnsi="Proxima Nova"/>
                 <w:rtl w:val="0"/>
               </w:rPr>
-              <w:t xml:space="preserve">Fuente</w:t>
+              <w:t xml:space="preserve">Soporte</w:t>
             </w:r>
           </w:p>
         </w:tc>
@@ -15131,7 +15191,7 @@
                 <w:rFonts w:ascii="Proxima Nova" w:cs="Proxima Nova" w:eastAsia="Proxima Nova" w:hAnsi="Proxima Nova"/>
                 <w:rtl w:val="0"/>
               </w:rPr>
-              <w:t xml:space="preserve">Interfaces funcionales de pacientes</w:t>
+              <w:t xml:space="preserve">Manual de uso del sistema</w:t>
             </w:r>
           </w:p>
         </w:tc>
@@ -15163,7 +15223,7 @@
                 <w:rFonts w:ascii="Proxima Nova" w:cs="Proxima Nova" w:eastAsia="Proxima Nova" w:hAnsi="Proxima Nova"/>
                 <w:rtl w:val="0"/>
               </w:rPr>
-              <w:t xml:space="preserve">SISCOP-PAC.jsx</w:t>
+              <w:t xml:space="preserve">SISCOP-MU.docx</w:t>
             </w:r>
           </w:p>
         </w:tc>
@@ -15235,7 +15295,7 @@
                 <w:rFonts w:ascii="Proxima Nova" w:cs="Proxima Nova" w:eastAsia="Proxima Nova" w:hAnsi="Proxima Nova"/>
                 <w:rtl w:val="0"/>
               </w:rPr>
-              <w:t xml:space="preserve">Fuente</w:t>
+              <w:t xml:space="preserve">Soporte</w:t>
             </w:r>
           </w:p>
         </w:tc>
@@ -15268,7 +15328,7 @@
                 <w:rFonts w:ascii="Proxima Nova" w:cs="Proxima Nova" w:eastAsia="Proxima Nova" w:hAnsi="Proxima Nova"/>
                 <w:rtl w:val="0"/>
               </w:rPr>
-              <w:t xml:space="preserve">Interfaces funcionales de historia clínica</w:t>
+              <w:t xml:space="preserve">Reporte de pruebas funcionales</w:t>
             </w:r>
           </w:p>
         </w:tc>
@@ -15301,7 +15361,7 @@
                 <w:rFonts w:ascii="Proxima Nova" w:cs="Proxima Nova" w:eastAsia="Proxima Nova" w:hAnsi="Proxima Nova"/>
                 <w:rtl w:val="0"/>
               </w:rPr>
-              <w:t xml:space="preserve">SISCOP-HC.jsx</w:t>
+              <w:t xml:space="preserve">SISCOP-RPF.docx</w:t>
             </w:r>
           </w:p>
         </w:tc>
@@ -15373,7 +15433,7 @@
                 <w:rFonts w:ascii="Proxima Nova" w:cs="Proxima Nova" w:eastAsia="Proxima Nova" w:hAnsi="Proxima Nova"/>
                 <w:rtl w:val="0"/>
               </w:rPr>
-              <w:t xml:space="preserve">Fuente</w:t>
+              <w:t xml:space="preserve">Soporte</w:t>
             </w:r>
           </w:p>
         </w:tc>
@@ -15405,7 +15465,7 @@
                 <w:rFonts w:ascii="Proxima Nova" w:cs="Proxima Nova" w:eastAsia="Proxima Nova" w:hAnsi="Proxima Nova"/>
                 <w:rtl w:val="0"/>
               </w:rPr>
-              <w:t xml:space="preserve">Interfaces funcionales de evaluación nutricional</w:t>
+              <w:t xml:space="preserve">Reporte de corrección de errores</w:t>
             </w:r>
           </w:p>
         </w:tc>
@@ -15437,7 +15497,7 @@
                 <w:rFonts w:ascii="Proxima Nova" w:cs="Proxima Nova" w:eastAsia="Proxima Nova" w:hAnsi="Proxima Nova"/>
                 <w:rtl w:val="0"/>
               </w:rPr>
-              <w:t xml:space="preserve">SISCOP-EVN.jsx</w:t>
+              <w:t xml:space="preserve">SISCOP-RCE.docx</w:t>
             </w:r>
           </w:p>
         </w:tc>
@@ -15509,554 +15569,6 @@
                 <w:rFonts w:ascii="Proxima Nova" w:cs="Proxima Nova" w:eastAsia="Proxima Nova" w:hAnsi="Proxima Nova"/>
                 <w:rtl w:val="0"/>
               </w:rPr>
-              <w:t xml:space="preserve">Fuente</w:t>
-            </w:r>
-          </w:p>
-        </w:tc>
-        <w:tc>
-          <w:tcPr>
-            <w:tcBorders>
-              <w:top w:color="e0e0e0" w:space="0" w:sz="8" w:val="single"/>
-              <w:left w:color="ffffff" w:space="0" w:sz="8" w:val="single"/>
-              <w:bottom w:color="e0e0e0" w:space="0" w:sz="8" w:val="single"/>
-              <w:right w:color="ffffff" w:space="0" w:sz="8" w:val="single"/>
-            </w:tcBorders>
-            <w:shd w:fill="efefef" w:val="clear"/>
-            <w:tcMar>
-              <w:top w:w="100.0" w:type="dxa"/>
-              <w:left w:w="100.0" w:type="dxa"/>
-              <w:bottom w:w="100.0" w:type="dxa"/>
-              <w:right w:w="100.0" w:type="dxa"/>
-            </w:tcMar>
-            <w:vAlign w:val="top"/>
-          </w:tcPr>
-          <w:p>
-            <w:pPr>
-              <w:spacing w:after="0" w:line="240" w:lineRule="auto"/>
-              <w:rPr>
-                <w:rFonts w:ascii="Proxima Nova" w:cs="Proxima Nova" w:eastAsia="Proxima Nova" w:hAnsi="Proxima Nova"/>
-              </w:rPr>
-            </w:pPr>
-            <w:r>
-              <w:rPr>
-                <w:rFonts w:ascii="Proxima Nova" w:cs="Proxima Nova" w:eastAsia="Proxima Nova" w:hAnsi="Proxima Nova"/>
-                <w:rtl w:val="0"/>
-              </w:rPr>
-              <w:t xml:space="preserve">Módulo gráfico</w:t>
-            </w:r>
-          </w:p>
-        </w:tc>
-        <w:tc>
-          <w:tcPr>
-            <w:tcBorders>
-              <w:top w:color="e0e0e0" w:space="0" w:sz="8" w:val="single"/>
-              <w:left w:color="ffffff" w:space="0" w:sz="8" w:val="single"/>
-              <w:bottom w:color="e0e0e0" w:space="0" w:sz="8" w:val="single"/>
-              <w:right w:color="ffffff" w:space="0" w:sz="8" w:val="single"/>
-            </w:tcBorders>
-            <w:shd w:fill="efefef" w:val="clear"/>
-            <w:tcMar>
-              <w:top w:w="100.0" w:type="dxa"/>
-              <w:left w:w="100.0" w:type="dxa"/>
-              <w:bottom w:w="100.0" w:type="dxa"/>
-              <w:right w:w="100.0" w:type="dxa"/>
-            </w:tcMar>
-            <w:vAlign w:val="top"/>
-          </w:tcPr>
-          <w:p>
-            <w:pPr>
-              <w:spacing w:after="0" w:line="240" w:lineRule="auto"/>
-              <w:rPr>
-                <w:rFonts w:ascii="Proxima Nova" w:cs="Proxima Nova" w:eastAsia="Proxima Nova" w:hAnsi="Proxima Nova"/>
-              </w:rPr>
-            </w:pPr>
-            <w:r>
-              <w:rPr>
-                <w:rFonts w:ascii="Proxima Nova" w:cs="Proxima Nova" w:eastAsia="Proxima Nova" w:hAnsi="Proxima Nova"/>
-                <w:rtl w:val="0"/>
-              </w:rPr>
-              <w:t xml:space="preserve">SISCOP-GRAF.jsx</w:t>
-            </w:r>
-          </w:p>
-        </w:tc>
-        <w:tc>
-          <w:tcPr>
-            <w:tcBorders>
-              <w:top w:color="e0e0e0" w:space="0" w:sz="8" w:val="single"/>
-              <w:left w:color="ffffff" w:space="0" w:sz="8" w:val="single"/>
-              <w:bottom w:color="e0e0e0" w:space="0" w:sz="8" w:val="single"/>
-              <w:right w:color="ffffff" w:space="0" w:sz="8" w:val="single"/>
-            </w:tcBorders>
-            <w:shd w:fill="efefef" w:val="clear"/>
-            <w:tcMar>
-              <w:top w:w="100.0" w:type="dxa"/>
-              <w:left w:w="100.0" w:type="dxa"/>
-              <w:bottom w:w="100.0" w:type="dxa"/>
-              <w:right w:w="100.0" w:type="dxa"/>
-            </w:tcMar>
-            <w:vAlign w:val="top"/>
-          </w:tcPr>
-          <w:p>
-            <w:pPr>
-              <w:spacing w:after="0" w:line="240" w:lineRule="auto"/>
-              <w:rPr>
-                <w:rFonts w:ascii="Proxima Nova" w:cs="Proxima Nova" w:eastAsia="Proxima Nova" w:hAnsi="Proxima Nova"/>
-              </w:rPr>
-            </w:pPr>
-            <w:r>
-              <w:rPr>
-                <w:rFonts w:ascii="Proxima Nova" w:cs="Proxima Nova" w:eastAsia="Proxima Nova" w:hAnsi="Proxima Nova"/>
-                <w:rtl w:val="0"/>
-              </w:rPr>
-              <w:t xml:space="preserve">SISCOP</w:t>
-            </w:r>
-          </w:p>
-        </w:tc>
-      </w:tr>
-      <w:tr>
-        <w:trPr>
-          <w:cantSplit w:val="0"/>
-          <w:trHeight w:val="500" w:hRule="atLeast"/>
-          <w:tblHeader w:val="0"/>
-        </w:trPr>
-        <w:tc>
-          <w:tcPr>
-            <w:tcBorders>
-              <w:top w:color="e0e0e0" w:space="0" w:sz="8" w:val="single"/>
-              <w:left w:color="ffffff" w:space="0" w:sz="8" w:val="single"/>
-              <w:bottom w:color="e0e0e0" w:space="0" w:sz="8" w:val="single"/>
-              <w:right w:color="ffffff" w:space="0" w:sz="8" w:val="single"/>
-            </w:tcBorders>
-            <w:tcMar>
-              <w:top w:w="100.0" w:type="dxa"/>
-              <w:left w:w="100.0" w:type="dxa"/>
-              <w:bottom w:w="100.0" w:type="dxa"/>
-              <w:right w:w="100.0" w:type="dxa"/>
-            </w:tcMar>
-            <w:vAlign w:val="top"/>
-          </w:tcPr>
-          <w:p>
-            <w:pPr>
-              <w:spacing w:after="0" w:line="240" w:lineRule="auto"/>
-              <w:rPr>
-                <w:rFonts w:ascii="Proxima Nova" w:cs="Proxima Nova" w:eastAsia="Proxima Nova" w:hAnsi="Proxima Nova"/>
-              </w:rPr>
-            </w:pPr>
-            <w:r>
-              <w:rPr>
-                <w:rFonts w:ascii="Proxima Nova" w:cs="Proxima Nova" w:eastAsia="Proxima Nova" w:hAnsi="Proxima Nova"/>
-                <w:rtl w:val="0"/>
-              </w:rPr>
-              <w:t xml:space="preserve">Soporte</w:t>
-            </w:r>
-          </w:p>
-        </w:tc>
-        <w:tc>
-          <w:tcPr>
-            <w:tcBorders>
-              <w:top w:color="e0e0e0" w:space="0" w:sz="8" w:val="single"/>
-              <w:left w:color="ffffff" w:space="0" w:sz="8" w:val="single"/>
-              <w:bottom w:color="e0e0e0" w:space="0" w:sz="8" w:val="single"/>
-              <w:right w:color="ffffff" w:space="0" w:sz="8" w:val="single"/>
-            </w:tcBorders>
-            <w:tcMar>
-              <w:top w:w="100.0" w:type="dxa"/>
-              <w:left w:w="100.0" w:type="dxa"/>
-              <w:bottom w:w="100.0" w:type="dxa"/>
-              <w:right w:w="100.0" w:type="dxa"/>
-            </w:tcMar>
-            <w:vAlign w:val="top"/>
-          </w:tcPr>
-          <w:p>
-            <w:pPr>
-              <w:spacing w:after="0" w:line="240" w:lineRule="auto"/>
-              <w:rPr>
-                <w:rFonts w:ascii="Proxima Nova" w:cs="Proxima Nova" w:eastAsia="Proxima Nova" w:hAnsi="Proxima Nova"/>
-              </w:rPr>
-            </w:pPr>
-            <w:r>
-              <w:rPr>
-                <w:rFonts w:ascii="Proxima Nova" w:cs="Proxima Nova" w:eastAsia="Proxima Nova" w:hAnsi="Proxima Nova"/>
-                <w:rtl w:val="0"/>
-              </w:rPr>
-              <w:t xml:space="preserve">Manual de uso del sistema</w:t>
-            </w:r>
-          </w:p>
-        </w:tc>
-        <w:tc>
-          <w:tcPr>
-            <w:tcBorders>
-              <w:top w:color="e0e0e0" w:space="0" w:sz="8" w:val="single"/>
-              <w:left w:color="ffffff" w:space="0" w:sz="8" w:val="single"/>
-              <w:bottom w:color="e0e0e0" w:space="0" w:sz="8" w:val="single"/>
-              <w:right w:color="ffffff" w:space="0" w:sz="8" w:val="single"/>
-            </w:tcBorders>
-            <w:tcMar>
-              <w:top w:w="100.0" w:type="dxa"/>
-              <w:left w:w="100.0" w:type="dxa"/>
-              <w:bottom w:w="100.0" w:type="dxa"/>
-              <w:right w:w="100.0" w:type="dxa"/>
-            </w:tcMar>
-            <w:vAlign w:val="top"/>
-          </w:tcPr>
-          <w:p>
-            <w:pPr>
-              <w:spacing w:after="0" w:line="240" w:lineRule="auto"/>
-              <w:rPr>
-                <w:rFonts w:ascii="Proxima Nova" w:cs="Proxima Nova" w:eastAsia="Proxima Nova" w:hAnsi="Proxima Nova"/>
-              </w:rPr>
-            </w:pPr>
-            <w:r>
-              <w:rPr>
-                <w:rFonts w:ascii="Proxima Nova" w:cs="Proxima Nova" w:eastAsia="Proxima Nova" w:hAnsi="Proxima Nova"/>
-                <w:rtl w:val="0"/>
-              </w:rPr>
-              <w:t xml:space="preserve">SISCOP-MU.docx</w:t>
-            </w:r>
-          </w:p>
-        </w:tc>
-        <w:tc>
-          <w:tcPr>
-            <w:tcBorders>
-              <w:top w:color="e0e0e0" w:space="0" w:sz="8" w:val="single"/>
-              <w:left w:color="ffffff" w:space="0" w:sz="8" w:val="single"/>
-              <w:bottom w:color="e0e0e0" w:space="0" w:sz="8" w:val="single"/>
-              <w:right w:color="ffffff" w:space="0" w:sz="8" w:val="single"/>
-            </w:tcBorders>
-            <w:tcMar>
-              <w:top w:w="100.0" w:type="dxa"/>
-              <w:left w:w="100.0" w:type="dxa"/>
-              <w:bottom w:w="100.0" w:type="dxa"/>
-              <w:right w:w="100.0" w:type="dxa"/>
-            </w:tcMar>
-            <w:vAlign w:val="top"/>
-          </w:tcPr>
-          <w:p>
-            <w:pPr>
-              <w:spacing w:after="0" w:line="240" w:lineRule="auto"/>
-              <w:rPr>
-                <w:rFonts w:ascii="Proxima Nova" w:cs="Proxima Nova" w:eastAsia="Proxima Nova" w:hAnsi="Proxima Nova"/>
-              </w:rPr>
-            </w:pPr>
-            <w:r>
-              <w:rPr>
-                <w:rFonts w:ascii="Proxima Nova" w:cs="Proxima Nova" w:eastAsia="Proxima Nova" w:hAnsi="Proxima Nova"/>
-                <w:rtl w:val="0"/>
-              </w:rPr>
-              <w:t xml:space="preserve">SISCOP</w:t>
-            </w:r>
-          </w:p>
-        </w:tc>
-      </w:tr>
-      <w:tr>
-        <w:trPr>
-          <w:cantSplit w:val="0"/>
-          <w:trHeight w:val="500" w:hRule="atLeast"/>
-          <w:tblHeader w:val="0"/>
-        </w:trPr>
-        <w:tc>
-          <w:tcPr>
-            <w:tcBorders>
-              <w:top w:color="e0e0e0" w:space="0" w:sz="8" w:val="single"/>
-              <w:left w:color="ffffff" w:space="0" w:sz="8" w:val="single"/>
-              <w:bottom w:color="e0e0e0" w:space="0" w:sz="8" w:val="single"/>
-              <w:right w:color="ffffff" w:space="0" w:sz="8" w:val="single"/>
-            </w:tcBorders>
-            <w:shd w:fill="efefef" w:val="clear"/>
-            <w:tcMar>
-              <w:top w:w="100.0" w:type="dxa"/>
-              <w:left w:w="100.0" w:type="dxa"/>
-              <w:bottom w:w="100.0" w:type="dxa"/>
-              <w:right w:w="100.0" w:type="dxa"/>
-            </w:tcMar>
-            <w:vAlign w:val="top"/>
-          </w:tcPr>
-          <w:p>
-            <w:pPr>
-              <w:spacing w:after="0" w:line="240" w:lineRule="auto"/>
-              <w:rPr>
-                <w:rFonts w:ascii="Proxima Nova" w:cs="Proxima Nova" w:eastAsia="Proxima Nova" w:hAnsi="Proxima Nova"/>
-              </w:rPr>
-            </w:pPr>
-            <w:r>
-              <w:rPr>
-                <w:rFonts w:ascii="Proxima Nova" w:cs="Proxima Nova" w:eastAsia="Proxima Nova" w:hAnsi="Proxima Nova"/>
-                <w:rtl w:val="0"/>
-              </w:rPr>
-              <w:t xml:space="preserve">Soporte</w:t>
-            </w:r>
-          </w:p>
-        </w:tc>
-        <w:tc>
-          <w:tcPr>
-            <w:tcBorders>
-              <w:top w:color="e0e0e0" w:space="0" w:sz="8" w:val="single"/>
-              <w:left w:color="ffffff" w:space="0" w:sz="8" w:val="single"/>
-              <w:bottom w:color="e0e0e0" w:space="0" w:sz="8" w:val="single"/>
-              <w:right w:color="ffffff" w:space="0" w:sz="8" w:val="single"/>
-            </w:tcBorders>
-            <w:shd w:fill="efefef" w:val="clear"/>
-            <w:tcMar>
-              <w:top w:w="100.0" w:type="dxa"/>
-              <w:left w:w="100.0" w:type="dxa"/>
-              <w:bottom w:w="100.0" w:type="dxa"/>
-              <w:right w:w="100.0" w:type="dxa"/>
-            </w:tcMar>
-            <w:vAlign w:val="top"/>
-          </w:tcPr>
-          <w:p>
-            <w:pPr>
-              <w:spacing w:after="0" w:line="240" w:lineRule="auto"/>
-              <w:rPr>
-                <w:rFonts w:ascii="Proxima Nova" w:cs="Proxima Nova" w:eastAsia="Proxima Nova" w:hAnsi="Proxima Nova"/>
-              </w:rPr>
-            </w:pPr>
-            <w:r>
-              <w:rPr>
-                <w:rFonts w:ascii="Proxima Nova" w:cs="Proxima Nova" w:eastAsia="Proxima Nova" w:hAnsi="Proxima Nova"/>
-                <w:rtl w:val="0"/>
-              </w:rPr>
-              <w:t xml:space="preserve">Reporte de pruebas funcionales</w:t>
-            </w:r>
-          </w:p>
-        </w:tc>
-        <w:tc>
-          <w:tcPr>
-            <w:tcBorders>
-              <w:top w:color="e0e0e0" w:space="0" w:sz="8" w:val="single"/>
-              <w:left w:color="ffffff" w:space="0" w:sz="8" w:val="single"/>
-              <w:bottom w:color="e0e0e0" w:space="0" w:sz="8" w:val="single"/>
-              <w:right w:color="ffffff" w:space="0" w:sz="8" w:val="single"/>
-            </w:tcBorders>
-            <w:shd w:fill="efefef" w:val="clear"/>
-            <w:tcMar>
-              <w:top w:w="100.0" w:type="dxa"/>
-              <w:left w:w="100.0" w:type="dxa"/>
-              <w:bottom w:w="100.0" w:type="dxa"/>
-              <w:right w:w="100.0" w:type="dxa"/>
-            </w:tcMar>
-            <w:vAlign w:val="top"/>
-          </w:tcPr>
-          <w:p>
-            <w:pPr>
-              <w:spacing w:after="0" w:line="240" w:lineRule="auto"/>
-              <w:rPr>
-                <w:rFonts w:ascii="Proxima Nova" w:cs="Proxima Nova" w:eastAsia="Proxima Nova" w:hAnsi="Proxima Nova"/>
-              </w:rPr>
-            </w:pPr>
-            <w:r>
-              <w:rPr>
-                <w:rFonts w:ascii="Proxima Nova" w:cs="Proxima Nova" w:eastAsia="Proxima Nova" w:hAnsi="Proxima Nova"/>
-                <w:rtl w:val="0"/>
-              </w:rPr>
-              <w:t xml:space="preserve">SISCOP-RPF.docx</w:t>
-            </w:r>
-          </w:p>
-        </w:tc>
-        <w:tc>
-          <w:tcPr>
-            <w:tcBorders>
-              <w:top w:color="e0e0e0" w:space="0" w:sz="8" w:val="single"/>
-              <w:left w:color="ffffff" w:space="0" w:sz="8" w:val="single"/>
-              <w:bottom w:color="e0e0e0" w:space="0" w:sz="8" w:val="single"/>
-              <w:right w:color="ffffff" w:space="0" w:sz="8" w:val="single"/>
-            </w:tcBorders>
-            <w:shd w:fill="efefef" w:val="clear"/>
-            <w:tcMar>
-              <w:top w:w="100.0" w:type="dxa"/>
-              <w:left w:w="100.0" w:type="dxa"/>
-              <w:bottom w:w="100.0" w:type="dxa"/>
-              <w:right w:w="100.0" w:type="dxa"/>
-            </w:tcMar>
-            <w:vAlign w:val="top"/>
-          </w:tcPr>
-          <w:p>
-            <w:pPr>
-              <w:spacing w:after="0" w:line="240" w:lineRule="auto"/>
-              <w:rPr>
-                <w:rFonts w:ascii="Proxima Nova" w:cs="Proxima Nova" w:eastAsia="Proxima Nova" w:hAnsi="Proxima Nova"/>
-              </w:rPr>
-            </w:pPr>
-            <w:r>
-              <w:rPr>
-                <w:rFonts w:ascii="Proxima Nova" w:cs="Proxima Nova" w:eastAsia="Proxima Nova" w:hAnsi="Proxima Nova"/>
-                <w:rtl w:val="0"/>
-              </w:rPr>
-              <w:t xml:space="preserve">SISCOP</w:t>
-            </w:r>
-          </w:p>
-        </w:tc>
-      </w:tr>
-      <w:tr>
-        <w:trPr>
-          <w:cantSplit w:val="0"/>
-          <w:trHeight w:val="500" w:hRule="atLeast"/>
-          <w:tblHeader w:val="0"/>
-        </w:trPr>
-        <w:tc>
-          <w:tcPr>
-            <w:tcBorders>
-              <w:top w:color="e0e0e0" w:space="0" w:sz="8" w:val="single"/>
-              <w:left w:color="ffffff" w:space="0" w:sz="8" w:val="single"/>
-              <w:bottom w:color="e0e0e0" w:space="0" w:sz="8" w:val="single"/>
-              <w:right w:color="ffffff" w:space="0" w:sz="8" w:val="single"/>
-            </w:tcBorders>
-            <w:tcMar>
-              <w:top w:w="100.0" w:type="dxa"/>
-              <w:left w:w="100.0" w:type="dxa"/>
-              <w:bottom w:w="100.0" w:type="dxa"/>
-              <w:right w:w="100.0" w:type="dxa"/>
-            </w:tcMar>
-            <w:vAlign w:val="top"/>
-          </w:tcPr>
-          <w:p>
-            <w:pPr>
-              <w:spacing w:after="0" w:line="240" w:lineRule="auto"/>
-              <w:rPr>
-                <w:rFonts w:ascii="Proxima Nova" w:cs="Proxima Nova" w:eastAsia="Proxima Nova" w:hAnsi="Proxima Nova"/>
-              </w:rPr>
-            </w:pPr>
-            <w:r>
-              <w:rPr>
-                <w:rFonts w:ascii="Proxima Nova" w:cs="Proxima Nova" w:eastAsia="Proxima Nova" w:hAnsi="Proxima Nova"/>
-                <w:rtl w:val="0"/>
-              </w:rPr>
-              <w:t xml:space="preserve">Soporte</w:t>
-            </w:r>
-          </w:p>
-        </w:tc>
-        <w:tc>
-          <w:tcPr>
-            <w:tcBorders>
-              <w:top w:color="e0e0e0" w:space="0" w:sz="8" w:val="single"/>
-              <w:left w:color="ffffff" w:space="0" w:sz="8" w:val="single"/>
-              <w:bottom w:color="e0e0e0" w:space="0" w:sz="8" w:val="single"/>
-              <w:right w:color="ffffff" w:space="0" w:sz="8" w:val="single"/>
-            </w:tcBorders>
-            <w:tcMar>
-              <w:top w:w="100.0" w:type="dxa"/>
-              <w:left w:w="100.0" w:type="dxa"/>
-              <w:bottom w:w="100.0" w:type="dxa"/>
-              <w:right w:w="100.0" w:type="dxa"/>
-            </w:tcMar>
-            <w:vAlign w:val="top"/>
-          </w:tcPr>
-          <w:p>
-            <w:pPr>
-              <w:spacing w:after="0" w:line="240" w:lineRule="auto"/>
-              <w:rPr>
-                <w:rFonts w:ascii="Proxima Nova" w:cs="Proxima Nova" w:eastAsia="Proxima Nova" w:hAnsi="Proxima Nova"/>
-              </w:rPr>
-            </w:pPr>
-            <w:r>
-              <w:rPr>
-                <w:rFonts w:ascii="Proxima Nova" w:cs="Proxima Nova" w:eastAsia="Proxima Nova" w:hAnsi="Proxima Nova"/>
-                <w:rtl w:val="0"/>
-              </w:rPr>
-              <w:t xml:space="preserve">Reporte de corrección de errores</w:t>
-            </w:r>
-          </w:p>
-        </w:tc>
-        <w:tc>
-          <w:tcPr>
-            <w:tcBorders>
-              <w:top w:color="e0e0e0" w:space="0" w:sz="8" w:val="single"/>
-              <w:left w:color="ffffff" w:space="0" w:sz="8" w:val="single"/>
-              <w:bottom w:color="e0e0e0" w:space="0" w:sz="8" w:val="single"/>
-              <w:right w:color="ffffff" w:space="0" w:sz="8" w:val="single"/>
-            </w:tcBorders>
-            <w:tcMar>
-              <w:top w:w="100.0" w:type="dxa"/>
-              <w:left w:w="100.0" w:type="dxa"/>
-              <w:bottom w:w="100.0" w:type="dxa"/>
-              <w:right w:w="100.0" w:type="dxa"/>
-            </w:tcMar>
-            <w:vAlign w:val="top"/>
-          </w:tcPr>
-          <w:p>
-            <w:pPr>
-              <w:spacing w:after="0" w:line="240" w:lineRule="auto"/>
-              <w:rPr>
-                <w:rFonts w:ascii="Proxima Nova" w:cs="Proxima Nova" w:eastAsia="Proxima Nova" w:hAnsi="Proxima Nova"/>
-              </w:rPr>
-            </w:pPr>
-            <w:r>
-              <w:rPr>
-                <w:rFonts w:ascii="Proxima Nova" w:cs="Proxima Nova" w:eastAsia="Proxima Nova" w:hAnsi="Proxima Nova"/>
-                <w:rtl w:val="0"/>
-              </w:rPr>
-              <w:t xml:space="preserve">SISCOP-RCE.docx</w:t>
-            </w:r>
-          </w:p>
-        </w:tc>
-        <w:tc>
-          <w:tcPr>
-            <w:tcBorders>
-              <w:top w:color="e0e0e0" w:space="0" w:sz="8" w:val="single"/>
-              <w:left w:color="ffffff" w:space="0" w:sz="8" w:val="single"/>
-              <w:bottom w:color="e0e0e0" w:space="0" w:sz="8" w:val="single"/>
-              <w:right w:color="ffffff" w:space="0" w:sz="8" w:val="single"/>
-            </w:tcBorders>
-            <w:tcMar>
-              <w:top w:w="100.0" w:type="dxa"/>
-              <w:left w:w="100.0" w:type="dxa"/>
-              <w:bottom w:w="100.0" w:type="dxa"/>
-              <w:right w:w="100.0" w:type="dxa"/>
-            </w:tcMar>
-            <w:vAlign w:val="top"/>
-          </w:tcPr>
-          <w:p>
-            <w:pPr>
-              <w:spacing w:after="0" w:line="240" w:lineRule="auto"/>
-              <w:rPr>
-                <w:rFonts w:ascii="Proxima Nova" w:cs="Proxima Nova" w:eastAsia="Proxima Nova" w:hAnsi="Proxima Nova"/>
-              </w:rPr>
-            </w:pPr>
-            <w:r>
-              <w:rPr>
-                <w:rFonts w:ascii="Proxima Nova" w:cs="Proxima Nova" w:eastAsia="Proxima Nova" w:hAnsi="Proxima Nova"/>
-                <w:rtl w:val="0"/>
-              </w:rPr>
-              <w:t xml:space="preserve">SISCOP</w:t>
-            </w:r>
-          </w:p>
-        </w:tc>
-      </w:tr>
-      <w:tr>
-        <w:trPr>
-          <w:cantSplit w:val="0"/>
-          <w:trHeight w:val="500" w:hRule="atLeast"/>
-          <w:tblHeader w:val="0"/>
-        </w:trPr>
-        <w:tc>
-          <w:tcPr>
-            <w:tcBorders>
-              <w:top w:color="e0e0e0" w:space="0" w:sz="8" w:val="single"/>
-              <w:left w:color="ffffff" w:space="0" w:sz="8" w:val="single"/>
-              <w:bottom w:color="e0e0e0" w:space="0" w:sz="8" w:val="single"/>
-              <w:right w:color="ffffff" w:space="0" w:sz="8" w:val="single"/>
-            </w:tcBorders>
-            <w:shd w:fill="efefef" w:val="clear"/>
-            <w:tcMar>
-              <w:top w:w="100.0" w:type="dxa"/>
-              <w:left w:w="100.0" w:type="dxa"/>
-              <w:bottom w:w="100.0" w:type="dxa"/>
-              <w:right w:w="100.0" w:type="dxa"/>
-            </w:tcMar>
-            <w:vAlign w:val="top"/>
-          </w:tcPr>
-          <w:p>
-            <w:pPr>
-              <w:spacing w:after="0" w:line="240" w:lineRule="auto"/>
-              <w:rPr>
-                <w:rFonts w:ascii="Proxima Nova" w:cs="Proxima Nova" w:eastAsia="Proxima Nova" w:hAnsi="Proxima Nova"/>
-              </w:rPr>
-            </w:pPr>
-            <w:r>
-              <w:rPr>
-                <w:rFonts w:ascii="Proxima Nova" w:cs="Proxima Nova" w:eastAsia="Proxima Nova" w:hAnsi="Proxima Nova"/>
-                <w:rtl w:val="0"/>
-              </w:rPr>
               <w:t xml:space="preserve">Soporte</w:t>
             </w:r>
           </w:p>
@@ -16457,64 +15969,8 @@
           <w:szCs w:val="26"/>
         </w:rPr>
       </w:pPr>
-      <w:bookmarkStart w:colFirst="0" w:colLast="0" w:name="_heading=h.vj78lnsq20za" w:id="13"/>
-      <w:bookmarkEnd w:id="13"/>
-      <w:r>
-        <w:rPr>
-          <w:rtl w:val="0"/>
-        </w:rPr>
-      </w:r>
-    </w:p>
-    <w:p>
-      <w:pPr>
-        <w:pStyle w:val="Heading2"/>
-        <w:spacing w:before="280" w:line="300" w:lineRule="auto"/>
-        <w:rPr/>
-      </w:pPr>
-      <w:bookmarkStart w:colFirst="0" w:colLast="0" w:name="_heading=h.y9nqzjtwa485" w:id="14"/>
+      <w:bookmarkStart w:colFirst="0" w:colLast="0" w:name="_heading=h.nir35oiw21ol" w:id="14"/>
       <w:bookmarkEnd w:id="14"/>
-      <w:r>
-        <w:rPr>
-          <w:rtl w:val="0"/>
-        </w:rPr>
-      </w:r>
-    </w:p>
-    <w:p>
-      <w:pPr>
-        <w:pStyle w:val="Heading2"/>
-        <w:rPr/>
-      </w:pPr>
-      <w:bookmarkStart w:colFirst="0" w:colLast="0" w:name="_heading=h.9eyuvf1fr5ij" w:id="15"/>
-      <w:bookmarkEnd w:id="15"/>
-      <w:r>
-        <w:rPr>
-          <w:rtl w:val="0"/>
-        </w:rPr>
-      </w:r>
-    </w:p>
-    <w:p>
-      <w:pPr>
-        <w:rPr/>
-      </w:pPr>
-      <w:r>
-        <w:rPr>
-          <w:rtl w:val="0"/>
-        </w:rPr>
-      </w:r>
-    </w:p>
-    <w:p>
-      <w:pPr>
-        <w:pStyle w:val="Heading2"/>
-        <w:spacing w:before="280" w:line="300" w:lineRule="auto"/>
-        <w:rPr>
-          <w:rFonts w:ascii="Proxima Nova" w:cs="Proxima Nova" w:eastAsia="Proxima Nova" w:hAnsi="Proxima Nova"/>
-          <w:color w:val="e61a17"/>
-          <w:sz w:val="26"/>
-          <w:szCs w:val="26"/>
-        </w:rPr>
-      </w:pPr>
-      <w:bookmarkStart w:colFirst="0" w:colLast="0" w:name="_heading=h.nir35oiw21ol" w:id="16"/>
-      <w:bookmarkEnd w:id="16"/>
       <w:r>
         <w:rPr>
           <w:rFonts w:ascii="Proxima Nova" w:cs="Proxima Nova" w:eastAsia="Proxima Nova" w:hAnsi="Proxima Nova"/>
@@ -16537,8 +15993,8 @@
           <w:szCs w:val="24"/>
         </w:rPr>
       </w:pPr>
-      <w:bookmarkStart w:colFirst="0" w:colLast="0" w:name="_heading=h.bxhjchb9zs5c" w:id="17"/>
-      <w:bookmarkEnd w:id="17"/>
+      <w:bookmarkStart w:colFirst="0" w:colLast="0" w:name="_heading=h.bxhjchb9zs5c" w:id="15"/>
+      <w:bookmarkEnd w:id="15"/>
       <w:r>
         <w:rPr>
           <w:rFonts w:ascii="Proxima Nova" w:cs="Proxima Nova" w:eastAsia="Proxima Nova" w:hAnsi="Proxima Nova"/>
@@ -16591,7 +16047,7 @@
     <w:sdt>
       <w:sdtPr>
         <w:lock w:val="contentLocked"/>
-        <w:id w:val="-1541270403"/>
+        <w:id w:val="1908159204"/>
         <w:tag w:val="goog_rdk_8"/>
       </w:sdtPr>
       <w:sdtContent>
@@ -17211,19 +16667,6 @@
     </w:sdt>
     <w:p>
       <w:pPr>
-        <w:spacing w:after="0" w:lineRule="auto"/>
-        <w:rPr>
-          <w:rFonts w:ascii="Proxima Nova" w:cs="Proxima Nova" w:eastAsia="Proxima Nova" w:hAnsi="Proxima Nova"/>
-        </w:rPr>
-      </w:pPr>
-      <w:r>
-        <w:rPr>
-          <w:rtl w:val="0"/>
-        </w:rPr>
-      </w:r>
-    </w:p>
-    <w:p>
-      <w:pPr>
         <w:pStyle w:val="Heading3"/>
         <w:spacing w:after="200" w:before="200" w:line="300" w:lineRule="auto"/>
         <w:rPr>
@@ -17233,8 +16676,8 @@
           <w:szCs w:val="24"/>
         </w:rPr>
       </w:pPr>
-      <w:bookmarkStart w:colFirst="0" w:colLast="0" w:name="_heading=h.s4picwsik5c" w:id="18"/>
-      <w:bookmarkEnd w:id="18"/>
+      <w:bookmarkStart w:colFirst="0" w:colLast="0" w:name="_heading=h.s4picwsik5c" w:id="16"/>
+      <w:bookmarkEnd w:id="16"/>
       <w:r>
         <w:rPr>
           <w:rFonts w:ascii="Proxima Nova" w:cs="Proxima Nova" w:eastAsia="Proxima Nova" w:hAnsi="Proxima Nova"/>
@@ -17287,7 +16730,7 @@
     <w:sdt>
       <w:sdtPr>
         <w:lock w:val="contentLocked"/>
-        <w:id w:val="463115729"/>
+        <w:id w:val="-1224077713"/>
         <w:tag w:val="goog_rdk_9"/>
       </w:sdtPr>
       <w:sdtContent>
@@ -17932,8 +17375,8 @@
           <w:szCs w:val="24"/>
         </w:rPr>
       </w:pPr>
-      <w:bookmarkStart w:colFirst="0" w:colLast="0" w:name="_heading=h.9kdwxdq3b8no" w:id="19"/>
-      <w:bookmarkEnd w:id="19"/>
+      <w:bookmarkStart w:colFirst="0" w:colLast="0" w:name="_heading=h.9kdwxdq3b8no" w:id="17"/>
+      <w:bookmarkEnd w:id="17"/>
       <w:r>
         <w:rPr>
           <w:rFonts w:ascii="Proxima Nova" w:cs="Proxima Nova" w:eastAsia="Proxima Nova" w:hAnsi="Proxima Nova"/>
@@ -18000,7 +17443,7 @@
     <w:sdt>
       <w:sdtPr>
         <w:lock w:val="contentLocked"/>
-        <w:id w:val="32185299"/>
+        <w:id w:val="-1910922167"/>
         <w:tag w:val="goog_rdk_10"/>
       </w:sdtPr>
       <w:sdtContent>
@@ -18630,8 +18073,8 @@
           <w:szCs w:val="2"/>
         </w:rPr>
       </w:pPr>
-      <w:bookmarkStart w:colFirst="0" w:colLast="0" w:name="_heading=h.mk1cieq3ek0x" w:id="20"/>
-      <w:bookmarkEnd w:id="20"/>
+      <w:bookmarkStart w:colFirst="0" w:colLast="0" w:name="_heading=h.mk1cieq3ek0x" w:id="18"/>
+      <w:bookmarkEnd w:id="18"/>
       <w:r>
         <w:rPr>
           <w:rtl w:val="0"/>
@@ -18649,8 +18092,8 @@
           <w:szCs w:val="24"/>
         </w:rPr>
       </w:pPr>
-      <w:bookmarkStart w:colFirst="0" w:colLast="0" w:name="_heading=h.xcrj75ku4jpb" w:id="21"/>
-      <w:bookmarkEnd w:id="21"/>
+      <w:bookmarkStart w:colFirst="0" w:colLast="0" w:name="_heading=h.xcrj75ku4jpb" w:id="19"/>
+      <w:bookmarkEnd w:id="19"/>
       <w:r>
         <w:rPr>
           <w:rFonts w:ascii="Proxima Nova" w:cs="Proxima Nova" w:eastAsia="Proxima Nova" w:hAnsi="Proxima Nova"/>
@@ -18703,7 +18146,7 @@
     <w:sdt>
       <w:sdtPr>
         <w:lock w:val="contentLocked"/>
-        <w:id w:val="1898854207"/>
+        <w:id w:val="213356149"/>
         <w:tag w:val="goog_rdk_11"/>
       </w:sdtPr>
       <w:sdtContent>
@@ -19344,8 +18787,8 @@
           <w:szCs w:val="24"/>
         </w:rPr>
       </w:pPr>
-      <w:bookmarkStart w:colFirst="0" w:colLast="0" w:name="_heading=h.9r440b4291p6" w:id="22"/>
-      <w:bookmarkEnd w:id="22"/>
+      <w:bookmarkStart w:colFirst="0" w:colLast="0" w:name="_heading=h.9r440b4291p6" w:id="20"/>
+      <w:bookmarkEnd w:id="20"/>
       <w:r>
         <w:rPr>
           <w:rFonts w:ascii="Proxima Nova" w:cs="Proxima Nova" w:eastAsia="Proxima Nova" w:hAnsi="Proxima Nova"/>
@@ -19398,7 +18841,7 @@
     <w:sdt>
       <w:sdtPr>
         <w:lock w:val="contentLocked"/>
-        <w:id w:val="29220524"/>
+        <w:id w:val="272412138"/>
         <w:tag w:val="goog_rdk_12"/>
       </w:sdtPr>
       <w:sdtContent>
@@ -20041,8 +19484,8 @@
           <w:szCs w:val="24"/>
         </w:rPr>
       </w:pPr>
-      <w:bookmarkStart w:colFirst="0" w:colLast="0" w:name="_heading=h.eifoq5cv39m2" w:id="23"/>
-      <w:bookmarkEnd w:id="23"/>
+      <w:bookmarkStart w:colFirst="0" w:colLast="0" w:name="_heading=h.eifoq5cv39m2" w:id="21"/>
+      <w:bookmarkEnd w:id="21"/>
       <w:r>
         <w:rPr>
           <w:rFonts w:ascii="Proxima Nova" w:cs="Proxima Nova" w:eastAsia="Proxima Nova" w:hAnsi="Proxima Nova"/>
@@ -20079,6 +19522,20 @@
     </w:p>
     <w:p>
       <w:pPr>
+        <w:rPr>
+          <w:rFonts w:ascii="Proxima Nova" w:cs="Proxima Nova" w:eastAsia="Proxima Nova" w:hAnsi="Proxima Nova"/>
+          <w:sz w:val="18"/>
+          <w:szCs w:val="18"/>
+        </w:rPr>
+      </w:pPr>
+      <w:r>
+        <w:rPr>
+          <w:rtl w:val="0"/>
+        </w:rPr>
+      </w:r>
+    </w:p>
+    <w:p>
+      <w:pPr>
         <w:spacing w:after="0" w:before="200" w:line="300" w:lineRule="auto"/>
         <w:rPr>
           <w:rFonts w:ascii="Proxima Nova" w:cs="Proxima Nova" w:eastAsia="Proxima Nova" w:hAnsi="Proxima Nova"/>
@@ -20095,7 +19552,7 @@
     <w:sdt>
       <w:sdtPr>
         <w:lock w:val="contentLocked"/>
-        <w:id w:val="-128513496"/>
+        <w:id w:val="16776065"/>
         <w:tag w:val="goog_rdk_13"/>
       </w:sdtPr>
       <w:sdtContent>
@@ -20716,19 +20173,6 @@
     </w:sdt>
     <w:p>
       <w:pPr>
-        <w:pStyle w:val="Heading3"/>
-        <w:rPr/>
-      </w:pPr>
-      <w:bookmarkStart w:colFirst="0" w:colLast="0" w:name="_heading=h.oqe1s47onip8" w:id="24"/>
-      <w:bookmarkEnd w:id="24"/>
-      <w:r>
-        <w:rPr>
-          <w:rtl w:val="0"/>
-        </w:rPr>
-      </w:r>
-    </w:p>
-    <w:p>
-      <w:pPr>
         <w:rPr/>
       </w:pPr>
       <w:r>
@@ -20748,8 +20192,8 @@
           <w:szCs w:val="24"/>
         </w:rPr>
       </w:pPr>
-      <w:bookmarkStart w:colFirst="0" w:colLast="0" w:name="_heading=h.7awh2jq81t3l" w:id="25"/>
-      <w:bookmarkEnd w:id="25"/>
+      <w:bookmarkStart w:colFirst="0" w:colLast="0" w:name="_heading=h.7awh2jq81t3l" w:id="22"/>
+      <w:bookmarkEnd w:id="22"/>
       <w:r>
         <w:rPr>
           <w:rFonts w:ascii="Proxima Nova" w:cs="Proxima Nova" w:eastAsia="Proxima Nova" w:hAnsi="Proxima Nova"/>
@@ -20802,7 +20246,7 @@
     <w:sdt>
       <w:sdtPr>
         <w:lock w:val="contentLocked"/>
-        <w:id w:val="91995477"/>
+        <w:id w:val="-2141465774"/>
         <w:tag w:val="goog_rdk_14"/>
       </w:sdtPr>
       <w:sdtContent>
@@ -21467,12 +20911,12 @@
           <wp:extent cx="8801100" cy="369875"/>
           <wp:effectExtent b="0" l="0" r="0" t="0"/>
           <wp:wrapNone/>
-          <wp:docPr descr="línea horizontal" id="4" name="image2.png"/>
+          <wp:docPr descr="línea horizontal" id="3" name="image1.png"/>
           <a:graphic>
             <a:graphicData uri="http://schemas.openxmlformats.org/drawingml/2006/picture">
               <pic:pic>
                 <pic:nvPicPr>
-                  <pic:cNvPr descr="línea horizontal" id="0" name="image2.png"/>
+                  <pic:cNvPr descr="línea horizontal" id="0" name="image1.png"/>
                   <pic:cNvPicPr preferRelativeResize="0"/>
                 </pic:nvPicPr>
                 <pic:blipFill>
@@ -21524,12 +20968,12 @@
           <wp:extent cx="8801100" cy="235267"/>
           <wp:effectExtent b="0" l="0" r="0" t="0"/>
           <wp:wrapNone/>
-          <wp:docPr descr="línea horizontal" id="2" name="image2.png"/>
+          <wp:docPr descr="línea horizontal" id="1" name="image1.png"/>
           <a:graphic>
             <a:graphicData uri="http://schemas.openxmlformats.org/drawingml/2006/picture">
               <pic:pic>
                 <pic:nvPicPr>
-                  <pic:cNvPr descr="línea horizontal" id="0" name="image2.png"/>
+                  <pic:cNvPr descr="línea horizontal" id="0" name="image1.png"/>
                   <pic:cNvPicPr preferRelativeResize="0"/>
                 </pic:nvPicPr>
                 <pic:blipFill>
@@ -22826,7 +22270,7 @@
 
 <file path=customXML/item1.xml><?xml version="1.0" encoding="utf-8"?>
 <go:gDocsCustomXmlDataStorage xmlns:go="http://customooxmlschemas.google.com/" xmlns:r="http://schemas.openxmlformats.org/officeDocument/2006/relationships" uri="GoogleDocsCustomDataVersion2">
-  <go:docsCustomData xmlns:go="http://customooxmlschemas.google.com/" roundtripDataSignature="AMtx7mgPHvqOGDtn967gwUi3EltnSbbnWg==">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</go:docsCustomData>
+  <go:docsCustomData xmlns:go="http://customooxmlschemas.google.com/" roundtripDataSignature="AMtx7mgm+fgK9Ks/L3LIQPDgJajdq+U5XQ==">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</go:docsCustomData>
 </go:gDocsCustomXmlDataStorage>
 </file>
 

</xml_diff>